<commit_message>
Web 0.02 animación u GEO de documentación para inversores sin fallo catastrófico
</commit_message>
<xml_diff>
--- a/dist/assets/investors/5ZeroCog_pre_sd_v1.docx
+++ b/dist/assets/investors/5ZeroCog_pre_sd_v1.docx
@@ -4,7 +4,8 @@
   <w:body>
     <w:p>
       <w:pPr>
-        <w:pStyle w:val="Normal"/>
+        <w:pStyle w:val="Ttulo1"/>
+        <w:spacing w:before="480" w:after="0"/>
         <w:rPr>
           <w:rFonts w:ascii="Liberation Serif" w:hAnsi="Liberation Serif"/>
           <w:b/>
@@ -17,19 +18,37 @@
       </w:pPr>
       <w:r>
         <w:rPr>
+          <w:rStyle w:val="Destaquemayor"/>
           <w:rFonts w:ascii="Liberation Serif" w:hAnsi="Liberation Serif"/>
+          <w:b/>
+          <w:sz w:val="36"/>
+          <w:szCs w:val="36"/>
+          <w:lang w:val="es-ES"/>
+        </w:rPr>
+        <w:t>ZeroCog — Propuesta de activación operativa y financiación puente</w:t>
+      </w:r>
+    </w:p>
+    <w:p>
+      <w:pPr>
+        <w:pStyle w:val="Lneahorizontal"/>
+        <w:rPr>
+          <w:rFonts w:ascii="Liberation Serif" w:hAnsi="Liberation Serif"/>
+          <w:b/>
           <w:b/>
           <w:bCs/>
           <w:sz w:val="36"/>
           <w:szCs w:val="36"/>
           <w:lang w:val="es-ES"/>
         </w:rPr>
-        <w:t>ZeroCog: Propuesta de activación operativa y financiación temprana</w:t>
+      </w:pPr>
+      <w:r>
+        <w:rPr/>
       </w:r>
     </w:p>
     <w:p>
       <w:pPr>
-        <w:pStyle w:val="Normal"/>
+        <w:pStyle w:val="Ttulo2"/>
+        <w:spacing w:before="200" w:after="283"/>
         <w:rPr>
           <w:rFonts w:ascii="Liberation Serif" w:hAnsi="Liberation Serif"/>
           <w:b/>
@@ -42,1320 +61,2411 @@
       </w:pPr>
       <w:r>
         <w:rPr>
+          <w:rStyle w:val="Destaquemayor"/>
+          <w:b/>
+        </w:rPr>
+        <w:t>1. Resumen ejecutivo</w:t>
+      </w:r>
+    </w:p>
+    <w:p>
+      <w:pPr>
+        <w:pStyle w:val="Cuerpodetexto"/>
+        <w:rPr>
           <w:rFonts w:ascii="Liberation Serif" w:hAnsi="Liberation Serif"/>
+          <w:b/>
           <w:b/>
           <w:bCs/>
           <w:sz w:val="36"/>
           <w:szCs w:val="36"/>
           <w:lang w:val="es-ES"/>
         </w:rPr>
+      </w:pPr>
+      <w:r>
+        <w:rPr/>
+        <w:t>ZeroCog es una arquitectura de contexto persistente y anonimización estructural que permite a sistemas de inteligencia artificial operar con memoria real sin exponer datos sensibles ni depender de un proveedor.</w:t>
       </w:r>
     </w:p>
     <w:p>
       <w:pPr>
-        <w:pStyle w:val="Normal"/>
+        <w:pStyle w:val="Cuerpodetexto"/>
         <w:rPr>
           <w:rFonts w:ascii="Liberation Serif" w:hAnsi="Liberation Serif"/>
+          <w:b/>
+          <w:b/>
+          <w:bCs/>
+          <w:sz w:val="36"/>
+          <w:szCs w:val="36"/>
           <w:lang w:val="es-ES"/>
         </w:rPr>
       </w:pPr>
       <w:r>
-        <w:rPr>
-          <w:rFonts w:ascii="Liberation Serif" w:hAnsi="Liberation Serif"/>
-          <w:b/>
-          <w:bCs/>
-          <w:sz w:val="28"/>
-          <w:szCs w:val="28"/>
-          <w:lang w:val="es-ES"/>
-        </w:rPr>
-        <w:t>1. Resumen ejecutivo</w:t>
+        <w:rPr/>
+        <w:t>El proyecto se encuentra en fase pre-seed, con:</w:t>
       </w:r>
     </w:p>
     <w:p>
       <w:pPr>
-        <w:pStyle w:val="Normal"/>
+        <w:pStyle w:val="Cuerpodetexto"/>
+        <w:numPr>
+          <w:ilvl w:val="0"/>
+          <w:numId w:val="7"/>
+        </w:numPr>
+        <w:tabs>
+          <w:tab w:val="clear" w:pos="720"/>
+          <w:tab w:val="left" w:pos="0" w:leader="none"/>
+        </w:tabs>
+        <w:spacing w:before="0" w:after="0"/>
+        <w:ind w:left="709" w:hanging="283"/>
         <w:rPr>
           <w:rFonts w:ascii="Liberation Serif" w:hAnsi="Liberation Serif"/>
+          <w:b/>
+          <w:b/>
+          <w:bCs/>
+          <w:sz w:val="36"/>
+          <w:szCs w:val="36"/>
           <w:lang w:val="es-ES"/>
         </w:rPr>
       </w:pPr>
       <w:r>
-        <w:rPr>
-          <w:rFonts w:ascii="Liberation Serif" w:hAnsi="Liberation Serif"/>
-          <w:sz w:val="24"/>
-          <w:szCs w:val="24"/>
-          <w:lang w:val="es-ES"/>
-        </w:rPr>
-        <w:t>ZeroCog es una arquitectura de contexto persistente y anonimización que permite a sistemas de inteligencia artificial operar con memoria real sin exponer datos sensibles.</w:t>
+        <w:rPr/>
+        <w:t xml:space="preserve">arquitectura definida </w:t>
       </w:r>
     </w:p>
     <w:p>
       <w:pPr>
-        <w:pStyle w:val="Normal"/>
+        <w:pStyle w:val="Cuerpodetexto"/>
+        <w:numPr>
+          <w:ilvl w:val="0"/>
+          <w:numId w:val="7"/>
+        </w:numPr>
+        <w:tabs>
+          <w:tab w:val="clear" w:pos="720"/>
+          <w:tab w:val="left" w:pos="0" w:leader="none"/>
+        </w:tabs>
+        <w:spacing w:before="0" w:after="0"/>
+        <w:ind w:left="709" w:hanging="283"/>
         <w:rPr>
           <w:rFonts w:ascii="Liberation Serif" w:hAnsi="Liberation Serif"/>
-          <w:sz w:val="24"/>
-          <w:szCs w:val="24"/>
+          <w:b/>
+          <w:b/>
+          <w:bCs/>
+          <w:sz w:val="36"/>
+          <w:szCs w:val="36"/>
           <w:lang w:val="es-ES"/>
         </w:rPr>
       </w:pPr>
       <w:r>
-        <w:rPr>
-          <w:rFonts w:ascii="Liberation Serif" w:hAnsi="Liberation Serif"/>
-          <w:sz w:val="24"/>
-          <w:szCs w:val="24"/>
-          <w:lang w:val="es-ES"/>
-        </w:rPr>
-        <w:t>El proyecto se encuentra en fase pre-seed, con especificación técnica completa, arquitectura definida y materiales de presentación desarrollados.</w:t>
+        <w:rPr/>
+        <w:t xml:space="preserve">documentación técnica completa </w:t>
       </w:r>
     </w:p>
     <w:p>
       <w:pPr>
-        <w:pStyle w:val="Normal"/>
+        <w:pStyle w:val="Cuerpodetexto"/>
+        <w:numPr>
+          <w:ilvl w:val="0"/>
+          <w:numId w:val="7"/>
+        </w:numPr>
+        <w:tabs>
+          <w:tab w:val="clear" w:pos="720"/>
+          <w:tab w:val="left" w:pos="0" w:leader="none"/>
+        </w:tabs>
+        <w:ind w:left="709" w:hanging="283"/>
         <w:rPr>
           <w:rFonts w:ascii="Liberation Serif" w:hAnsi="Liberation Serif"/>
+          <w:b/>
+          <w:b/>
+          <w:bCs/>
+          <w:sz w:val="36"/>
+          <w:szCs w:val="36"/>
           <w:lang w:val="es-ES"/>
         </w:rPr>
       </w:pPr>
       <w:r>
-        <w:rPr>
-          <w:rFonts w:ascii="Liberation Serif" w:hAnsi="Liberation Serif"/>
-          <w:sz w:val="24"/>
-          <w:szCs w:val="24"/>
-          <w:lang w:val="es-ES"/>
-        </w:rPr>
-        <w:t>Se plantea una inversión inicial de 15.000 – 30.000 € destinada a activar la fase operativa del proyecto, permitiendo desarrollo continuo, validación técnica y preparación para financiación posterior.</w:t>
+        <w:rPr/>
+        <w:t xml:space="preserve">demostración funcional del flujo conceptual </w:t>
       </w:r>
     </w:p>
     <w:p>
       <w:pPr>
-        <w:pStyle w:val="Normal"/>
+        <w:pStyle w:val="Cuerpodetexto"/>
         <w:rPr>
-          <w:sz w:val="24"/>
-          <w:szCs w:val="24"/>
+          <w:rFonts w:ascii="Liberation Serif" w:hAnsi="Liberation Serif"/>
+          <w:b/>
+          <w:b/>
+          <w:bCs/>
+          <w:sz w:val="36"/>
+          <w:szCs w:val="36"/>
+          <w:lang w:val="es-ES"/>
         </w:rPr>
       </w:pPr>
+      <w:r>
+        <w:rPr/>
+        <w:t xml:space="preserve">Se plantea una </w:t>
+      </w:r>
       <w:r>
         <w:rPr>
-          <w:rFonts w:ascii="Liberation Serif" w:hAnsi="Liberation Serif"/>
-          <w:lang w:val="es-ES"/>
+          <w:rStyle w:val="Destaquemayor"/>
         </w:rPr>
+        <w:t>ronda de activación y transición</w:t>
+      </w:r>
+      <w:r>
+        <w:rPr/>
+        <w:t xml:space="preserve"> destinada a:</w:t>
       </w:r>
     </w:p>
     <w:p>
       <w:pPr>
-        <w:pStyle w:val="Normal"/>
+        <w:pStyle w:val="Cuerpodetexto"/>
+        <w:numPr>
+          <w:ilvl w:val="0"/>
+          <w:numId w:val="8"/>
+        </w:numPr>
+        <w:tabs>
+          <w:tab w:val="clear" w:pos="720"/>
+          <w:tab w:val="left" w:pos="0" w:leader="none"/>
+        </w:tabs>
+        <w:spacing w:before="0" w:after="0"/>
+        <w:ind w:left="709" w:hanging="283"/>
         <w:rPr>
           <w:rFonts w:ascii="Liberation Serif" w:hAnsi="Liberation Serif"/>
+          <w:b/>
+          <w:b/>
+          <w:bCs/>
+          <w:sz w:val="36"/>
+          <w:szCs w:val="36"/>
           <w:lang w:val="es-ES"/>
         </w:rPr>
       </w:pPr>
       <w:r>
-        <w:rPr>
-          <w:rFonts w:ascii="Liberation Serif" w:hAnsi="Liberation Serif"/>
-          <w:b/>
-          <w:bCs/>
-          <w:sz w:val="28"/>
-          <w:szCs w:val="28"/>
-          <w:lang w:val="es-ES"/>
-        </w:rPr>
-        <w:t>2. Estado actual</w:t>
+        <w:rPr/>
+        <w:t xml:space="preserve">ejecutar el núcleo técnico </w:t>
       </w:r>
     </w:p>
     <w:p>
       <w:pPr>
-        <w:pStyle w:val="Normal"/>
-        <w:rPr>
-          <w:b/>
-          <w:b/>
-          <w:bCs/>
-          <w:sz w:val="28"/>
-          <w:szCs w:val="28"/>
-        </w:rPr>
-      </w:pPr>
-      <w:r>
+        <w:pStyle w:val="Cuerpodetexto"/>
+        <w:numPr>
+          <w:ilvl w:val="0"/>
+          <w:numId w:val="8"/>
+        </w:numPr>
+        <w:tabs>
+          <w:tab w:val="clear" w:pos="720"/>
+          <w:tab w:val="left" w:pos="0" w:leader="none"/>
+        </w:tabs>
+        <w:spacing w:before="0" w:after="0"/>
+        <w:ind w:left="709" w:hanging="283"/>
         <w:rPr>
           <w:rFonts w:ascii="Liberation Serif" w:hAnsi="Liberation Serif"/>
+          <w:b/>
+          <w:b/>
+          <w:bCs/>
+          <w:sz w:val="36"/>
+          <w:szCs w:val="36"/>
           <w:lang w:val="es-ES"/>
         </w:rPr>
+      </w:pPr>
+      <w:r>
+        <w:rPr/>
+        <w:t xml:space="preserve">validar el sistema en condiciones reales </w:t>
       </w:r>
     </w:p>
     <w:p>
       <w:pPr>
-        <w:pStyle w:val="Normal"/>
+        <w:pStyle w:val="Cuerpodetexto"/>
+        <w:numPr>
+          <w:ilvl w:val="0"/>
+          <w:numId w:val="8"/>
+        </w:numPr>
+        <w:tabs>
+          <w:tab w:val="clear" w:pos="720"/>
+          <w:tab w:val="left" w:pos="0" w:leader="none"/>
+        </w:tabs>
+        <w:ind w:left="709" w:hanging="283"/>
         <w:rPr>
           <w:rFonts w:ascii="Liberation Serif" w:hAnsi="Liberation Serif"/>
+          <w:b/>
+          <w:b/>
+          <w:bCs/>
+          <w:sz w:val="36"/>
+          <w:szCs w:val="36"/>
           <w:lang w:val="es-ES"/>
         </w:rPr>
       </w:pPr>
       <w:r>
-        <w:rPr>
-          <w:rFonts w:ascii="Liberation Serif" w:hAnsi="Liberation Serif"/>
-          <w:lang w:val="es-ES"/>
-        </w:rPr>
-        <w:t>Proyecto: ZeroCog</w:t>
+        <w:rPr/>
+        <w:t xml:space="preserve">preparar el acceso a financiación estructurada (ENISA) </w:t>
       </w:r>
     </w:p>
     <w:p>
       <w:pPr>
-        <w:pStyle w:val="Normal"/>
+        <w:pStyle w:val="Lneahorizontal"/>
         <w:rPr>
           <w:rFonts w:ascii="Liberation Serif" w:hAnsi="Liberation Serif"/>
+          <w:b/>
+          <w:b/>
+          <w:bCs/>
+          <w:sz w:val="36"/>
+          <w:szCs w:val="36"/>
           <w:lang w:val="es-ES"/>
         </w:rPr>
       </w:pPr>
       <w:r>
-        <w:rPr>
-          <w:rFonts w:ascii="Liberation Serif" w:hAnsi="Liberation Serif"/>
-          <w:lang w:val="es-ES"/>
-        </w:rPr>
-        <w:t>Fase: Pre-seed</w:t>
+        <w:rPr/>
       </w:r>
     </w:p>
     <w:p>
       <w:pPr>
-        <w:pStyle w:val="Normal"/>
+        <w:pStyle w:val="Ttulo2"/>
+        <w:spacing w:before="200" w:after="283"/>
         <w:rPr>
           <w:rFonts w:ascii="Liberation Serif" w:hAnsi="Liberation Serif"/>
+          <w:b/>
+          <w:b/>
+          <w:bCs/>
+          <w:sz w:val="36"/>
+          <w:szCs w:val="36"/>
           <w:lang w:val="es-ES"/>
         </w:rPr>
       </w:pPr>
       <w:r>
         <w:rPr>
-          <w:rFonts w:ascii="Liberation Serif" w:hAnsi="Liberation Serif"/>
-          <w:lang w:val="es-ES"/>
+          <w:rStyle w:val="Destaquemayor"/>
+          <w:b/>
         </w:rPr>
-        <w:t>Equipo: Fundador único</w:t>
+        <w:t>2. Naturaleza de la inversión</w:t>
       </w:r>
     </w:p>
     <w:p>
       <w:pPr>
-        <w:pStyle w:val="Normal"/>
+        <w:pStyle w:val="Cuerpodetexto"/>
         <w:rPr>
           <w:rFonts w:ascii="Liberation Serif" w:hAnsi="Liberation Serif"/>
+          <w:b/>
+          <w:b/>
+          <w:bCs/>
+          <w:sz w:val="36"/>
+          <w:szCs w:val="36"/>
           <w:lang w:val="es-ES"/>
         </w:rPr>
       </w:pPr>
       <w:r>
-        <w:rPr>
-          <w:rFonts w:ascii="Liberation Serif" w:hAnsi="Liberation Serif"/>
-          <w:lang w:val="es-ES"/>
-        </w:rPr>
-        <w:t>Activos: Documentación técnica, arquitectura, web y materiales de inversor</w:t>
+        <w:rPr/>
+        <w:t>Esta ronda no es una fase de crecimiento.</w:t>
       </w:r>
     </w:p>
     <w:p>
       <w:pPr>
-        <w:pStyle w:val="Normal"/>
+        <w:pStyle w:val="Cuerpodetexto"/>
         <w:rPr>
           <w:rFonts w:ascii="Liberation Serif" w:hAnsi="Liberation Serif"/>
+          <w:b/>
+          <w:b/>
+          <w:bCs/>
+          <w:sz w:val="36"/>
+          <w:szCs w:val="36"/>
           <w:lang w:val="es-ES"/>
         </w:rPr>
       </w:pPr>
       <w:r>
+        <w:rPr/>
+        <w:t xml:space="preserve">Es una </w:t>
+      </w:r>
+      <w:r>
         <w:rPr>
-          <w:rFonts w:ascii="Liberation Serif" w:hAnsi="Liberation Serif"/>
-          <w:lang w:val="es-ES"/>
+          <w:rStyle w:val="Destaquemayor"/>
         </w:rPr>
-        <w:t>Recursos actuales: Sin capital suficiente para dedicación exclusiva</w:t>
+        <w:t>financiación puente</w:t>
+      </w:r>
+      <w:r>
+        <w:rPr/>
+        <w:t xml:space="preserve"> entre:</w:t>
       </w:r>
     </w:p>
     <w:p>
       <w:pPr>
-        <w:pStyle w:val="Normal"/>
+        <w:sectPr>
+          <w:type w:val="nextPage"/>
+          <w:pgSz w:w="12240" w:h="15840"/>
+          <w:pgMar w:left="1800" w:right="1800" w:gutter="0" w:header="0" w:top="1440" w:footer="0" w:bottom="1440"/>
+          <w:pgNumType w:fmt="decimal"/>
+          <w:formProt w:val="false"/>
+          <w:textDirection w:val="lrTb"/>
+          <w:docGrid w:type="default" w:linePitch="360" w:charSpace="4096"/>
+        </w:sectPr>
+      </w:pPr>
+    </w:p>
+    <w:p>
+      <w:pPr>
+        <w:pStyle w:val="Textopreformateado"/>
         <w:rPr>
           <w:rFonts w:ascii="Liberation Serif" w:hAnsi="Liberation Serif"/>
+          <w:b/>
+          <w:b/>
+          <w:bCs/>
+          <w:sz w:val="36"/>
+          <w:szCs w:val="36"/>
           <w:lang w:val="es-ES"/>
         </w:rPr>
       </w:pPr>
       <w:r>
-        <w:rPr>
-          <w:rFonts w:ascii="Liberation Serif" w:hAnsi="Liberation Serif"/>
-          <w:lang w:val="es-ES"/>
-        </w:rPr>
-        <w:t>Localización: Málaga / área metropolitana</w:t>
+        <w:rPr/>
+        <w:t>fase conceptual validada</w:t>
       </w:r>
     </w:p>
     <w:p>
       <w:pPr>
-        <w:pStyle w:val="Normal"/>
+        <w:pStyle w:val="Textopreformateado"/>
         <w:rPr>
           <w:rFonts w:ascii="Liberation Serif" w:hAnsi="Liberation Serif"/>
+          <w:b/>
+          <w:b/>
+          <w:bCs/>
+          <w:sz w:val="36"/>
+          <w:szCs w:val="36"/>
           <w:lang w:val="es-ES"/>
         </w:rPr>
       </w:pPr>
       <w:r>
-        <w:rPr>
-          <w:rFonts w:ascii="Liberation Serif" w:hAnsi="Liberation Serif"/>
-          <w:lang w:val="es-ES"/>
-        </w:rPr>
+        <w:rPr/>
+        <w:t>→</w:t>
       </w:r>
     </w:p>
     <w:p>
       <w:pPr>
-        <w:pStyle w:val="Normal"/>
+        <w:pStyle w:val="Textopreformateado"/>
         <w:rPr>
           <w:rFonts w:ascii="Liberation Serif" w:hAnsi="Liberation Serif"/>
           <w:b/>
           <w:b/>
           <w:bCs/>
-          <w:sz w:val="28"/>
-          <w:szCs w:val="28"/>
+          <w:sz w:val="36"/>
+          <w:szCs w:val="36"/>
           <w:lang w:val="es-ES"/>
         </w:rPr>
       </w:pPr>
       <w:r>
+        <w:rPr/>
+        <w:t>financiación institucional (ENISA)</w:t>
+      </w:r>
+    </w:p>
+    <w:p>
+      <w:pPr>
+        <w:sectPr>
+          <w:type w:val="continuous"/>
+          <w:pgSz w:w="12240" w:h="15840"/>
+          <w:pgMar w:left="1800" w:right="1800" w:gutter="0" w:header="0" w:top="1440" w:footer="0" w:bottom="1440"/>
+          <w:formProt w:val="false"/>
+          <w:textDirection w:val="lrTb"/>
+          <w:docGrid w:type="default" w:linePitch="360" w:charSpace="4096"/>
+        </w:sectPr>
+      </w:pPr>
+    </w:p>
+    <w:p>
+      <w:pPr>
+        <w:pStyle w:val="Cuerpodetexto"/>
         <w:rPr>
           <w:rFonts w:ascii="Liberation Serif" w:hAnsi="Liberation Serif"/>
           <w:b/>
+          <w:b/>
           <w:bCs/>
-          <w:sz w:val="28"/>
-          <w:szCs w:val="28"/>
+          <w:sz w:val="36"/>
+          <w:szCs w:val="36"/>
           <w:lang w:val="es-ES"/>
+        </w:rPr>
+      </w:pPr>
+      <w:r>
+        <w:rPr/>
+        <w:t>El capital permite sostener ejecución continua hasta alcanzar ese punto.</w:t>
+      </w:r>
+    </w:p>
+    <w:p>
+      <w:pPr>
+        <w:pStyle w:val="Lneahorizontal"/>
+        <w:rPr>
+          <w:rFonts w:ascii="Liberation Serif" w:hAnsi="Liberation Serif"/>
+          <w:b/>
+          <w:b/>
+          <w:bCs/>
+          <w:sz w:val="36"/>
+          <w:szCs w:val="36"/>
+          <w:lang w:val="es-ES"/>
+        </w:rPr>
+      </w:pPr>
+      <w:r>
+        <w:rPr/>
+      </w:r>
+    </w:p>
+    <w:p>
+      <w:pPr>
+        <w:pStyle w:val="Ttulo2"/>
+        <w:spacing w:before="200" w:after="283"/>
+        <w:rPr>
+          <w:rFonts w:ascii="Liberation Serif" w:hAnsi="Liberation Serif"/>
+          <w:b/>
+          <w:b/>
+          <w:bCs/>
+          <w:sz w:val="36"/>
+          <w:szCs w:val="36"/>
+          <w:lang w:val="es-ES"/>
+        </w:rPr>
+      </w:pPr>
+      <w:r>
+        <w:rPr>
+          <w:rStyle w:val="Destaquemayor"/>
+          <w:b/>
         </w:rPr>
         <w:t>3. Necesidad de capital</w:t>
       </w:r>
     </w:p>
     <w:p>
       <w:pPr>
-        <w:pStyle w:val="Normal"/>
+        <w:pStyle w:val="Cuerpodetexto"/>
         <w:rPr>
           <w:rFonts w:ascii="Liberation Serif" w:hAnsi="Liberation Serif"/>
+          <w:b/>
+          <w:b/>
+          <w:bCs/>
+          <w:sz w:val="36"/>
+          <w:szCs w:val="36"/>
           <w:lang w:val="es-ES"/>
         </w:rPr>
       </w:pPr>
       <w:r>
         <w:rPr>
-          <w:rFonts w:ascii="Liberation Serif" w:hAnsi="Liberation Serif"/>
-          <w:lang w:val="es-ES"/>
+          <w:rStyle w:val="Destaquemayor"/>
         </w:rPr>
+        <w:t>Horizonte operativo:</w:t>
+      </w:r>
+      <w:r>
+        <w:rPr/>
+        <w:t xml:space="preserve"> 9 – 12 meses</w:t>
       </w:r>
     </w:p>
     <w:p>
       <w:pPr>
-        <w:pStyle w:val="Normal"/>
+        <w:pStyle w:val="Cuerpodetexto"/>
         <w:rPr>
           <w:rFonts w:ascii="Liberation Serif" w:hAnsi="Liberation Serif"/>
+          <w:b/>
+          <w:b/>
+          <w:bCs/>
+          <w:sz w:val="36"/>
+          <w:szCs w:val="36"/>
           <w:lang w:val="es-ES"/>
         </w:rPr>
       </w:pPr>
       <w:r>
         <w:rPr>
-          <w:rFonts w:ascii="Liberation Serif" w:hAnsi="Liberation Serif"/>
-          <w:lang w:val="es-ES"/>
+          <w:rStyle w:val="Destaquemayor"/>
         </w:rPr>
-        <w:t>Coste operativo del fundador:</w:t>
+        <w:t>Estructura</w:t>
       </w:r>
     </w:p>
     <w:p>
       <w:pPr>
-        <w:pStyle w:val="Normal"/>
+        <w:pStyle w:val="Cuerpodetexto"/>
+        <w:numPr>
+          <w:ilvl w:val="0"/>
+          <w:numId w:val="9"/>
+        </w:numPr>
+        <w:tabs>
+          <w:tab w:val="clear" w:pos="720"/>
+          <w:tab w:val="left" w:pos="0" w:leader="none"/>
+        </w:tabs>
+        <w:spacing w:before="0" w:after="0"/>
+        <w:ind w:left="709" w:hanging="283"/>
         <w:rPr>
           <w:rFonts w:ascii="Liberation Serif" w:hAnsi="Liberation Serif"/>
+          <w:b/>
+          <w:b/>
+          <w:bCs/>
+          <w:sz w:val="36"/>
+          <w:szCs w:val="36"/>
           <w:lang w:val="es-ES"/>
         </w:rPr>
       </w:pPr>
       <w:r>
-        <w:rPr>
-          <w:rFonts w:ascii="Liberation Serif" w:hAnsi="Liberation Serif"/>
-          <w:lang w:val="es-ES"/>
-        </w:rPr>
-        <w:t>1.700 – 1.900 € / mes (coste empresa)</w:t>
+        <w:rPr/>
+        <w:t xml:space="preserve">mantenimiento del fundador (ejecución técnica) </w:t>
       </w:r>
     </w:p>
     <w:p>
       <w:pPr>
-        <w:pStyle w:val="Normal"/>
+        <w:pStyle w:val="Cuerpodetexto"/>
+        <w:numPr>
+          <w:ilvl w:val="0"/>
+          <w:numId w:val="9"/>
+        </w:numPr>
+        <w:tabs>
+          <w:tab w:val="clear" w:pos="720"/>
+          <w:tab w:val="left" w:pos="0" w:leader="none"/>
+        </w:tabs>
+        <w:spacing w:before="0" w:after="0"/>
+        <w:ind w:left="709" w:hanging="283"/>
         <w:rPr>
           <w:rFonts w:ascii="Liberation Serif" w:hAnsi="Liberation Serif"/>
+          <w:b/>
+          <w:b/>
+          <w:bCs/>
+          <w:sz w:val="36"/>
+          <w:szCs w:val="36"/>
           <w:lang w:val="es-ES"/>
         </w:rPr>
       </w:pPr>
       <w:r>
-        <w:rPr>
-          <w:rFonts w:ascii="Liberation Serif" w:hAnsi="Liberation Serif"/>
-          <w:lang w:val="es-ES"/>
-        </w:rPr>
+        <w:rPr/>
+        <w:t xml:space="preserve">costes operativos mínimos </w:t>
       </w:r>
     </w:p>
     <w:p>
       <w:pPr>
-        <w:pStyle w:val="Normal"/>
+        <w:pStyle w:val="Cuerpodetexto"/>
+        <w:numPr>
+          <w:ilvl w:val="0"/>
+          <w:numId w:val="9"/>
+        </w:numPr>
+        <w:tabs>
+          <w:tab w:val="clear" w:pos="720"/>
+          <w:tab w:val="left" w:pos="0" w:leader="none"/>
+        </w:tabs>
+        <w:ind w:left="709" w:hanging="283"/>
         <w:rPr>
           <w:rFonts w:ascii="Liberation Serif" w:hAnsi="Liberation Serif"/>
+          <w:b/>
+          <w:b/>
+          <w:bCs/>
+          <w:sz w:val="36"/>
+          <w:szCs w:val="36"/>
           <w:lang w:val="es-ES"/>
         </w:rPr>
       </w:pPr>
       <w:r>
-        <w:rPr>
-          <w:rFonts w:ascii="Liberation Serif" w:hAnsi="Liberation Serif"/>
-          <w:lang w:val="es-ES"/>
-        </w:rPr>
-        <w:t>Horizonte operativo:</w:t>
+        <w:rPr/>
+        <w:t xml:space="preserve">preparación del acceso a financiación pública </w:t>
       </w:r>
     </w:p>
     <w:p>
       <w:pPr>
-        <w:pStyle w:val="Normal"/>
+        <w:pStyle w:val="Cuerpodetexto"/>
         <w:rPr>
           <w:rFonts w:ascii="Liberation Serif" w:hAnsi="Liberation Serif"/>
+          <w:b/>
+          <w:b/>
+          <w:bCs/>
+          <w:sz w:val="36"/>
+          <w:szCs w:val="36"/>
           <w:lang w:val="es-ES"/>
         </w:rPr>
       </w:pPr>
       <w:r>
         <w:rPr>
-          <w:rFonts w:ascii="Liberation Serif" w:hAnsi="Liberation Serif"/>
-          <w:lang w:val="es-ES"/>
+          <w:rStyle w:val="Destaquemayor"/>
         </w:rPr>
-        <w:t>9 – 12 meses</w:t>
+        <w:t>Rango de inversión</w:t>
       </w:r>
     </w:p>
     <w:p>
       <w:pPr>
-        <w:pStyle w:val="Normal"/>
+        <w:sectPr>
+          <w:type w:val="continuous"/>
+          <w:pgSz w:w="12240" w:h="15840"/>
+          <w:pgMar w:left="1800" w:right="1800" w:gutter="0" w:header="0" w:top="1440" w:footer="0" w:bottom="1440"/>
+          <w:pgNumType w:fmt="decimal"/>
+          <w:formProt w:val="false"/>
+          <w:textDirection w:val="lrTb"/>
+          <w:docGrid w:type="default" w:linePitch="360" w:charSpace="4096"/>
+        </w:sectPr>
+      </w:pPr>
+    </w:p>
+    <w:p>
+      <w:pPr>
+        <w:pStyle w:val="Textopreformateado"/>
         <w:rPr>
           <w:rFonts w:ascii="Liberation Serif" w:hAnsi="Liberation Serif"/>
+          <w:b/>
+          <w:b/>
+          <w:bCs/>
+          <w:sz w:val="36"/>
+          <w:szCs w:val="36"/>
           <w:lang w:val="es-ES"/>
         </w:rPr>
       </w:pPr>
+      <w:bookmarkStart w:id="0" w:name="code-block-viewer"/>
+      <w:bookmarkEnd w:id="0"/>
       <w:r>
-        <w:rPr>
-          <w:rFonts w:ascii="Liberation Serif" w:hAnsi="Liberation Serif"/>
-          <w:lang w:val="es-ES"/>
-        </w:rPr>
+        <w:rPr/>
+        <w:t>30.000 – 60.000 €</w:t>
       </w:r>
     </w:p>
     <w:p>
       <w:pPr>
-        <w:pStyle w:val="Normal"/>
+        <w:sectPr>
+          <w:type w:val="continuous"/>
+          <w:pgSz w:w="12240" w:h="15840"/>
+          <w:pgMar w:left="1800" w:right="1800" w:gutter="0" w:header="0" w:top="1440" w:footer="0" w:bottom="1440"/>
+          <w:formProt w:val="false"/>
+          <w:textDirection w:val="lrTb"/>
+          <w:docGrid w:type="default" w:linePitch="360" w:charSpace="4096"/>
+        </w:sectPr>
+      </w:pPr>
+    </w:p>
+    <w:p>
+      <w:pPr>
+        <w:pStyle w:val="Cuerpodetexto"/>
         <w:rPr>
           <w:rFonts w:ascii="Liberation Serif" w:hAnsi="Liberation Serif"/>
+          <w:b/>
+          <w:b/>
+          <w:bCs/>
+          <w:sz w:val="36"/>
+          <w:szCs w:val="36"/>
           <w:lang w:val="es-ES"/>
         </w:rPr>
       </w:pPr>
       <w:r>
-        <w:rPr>
-          <w:rFonts w:ascii="Liberation Serif" w:hAnsi="Liberation Serif"/>
-          <w:lang w:val="es-ES"/>
-        </w:rPr>
-        <w:t>Capital requerido:</w:t>
+        <w:rPr/>
+        <w:t>Este rango permite:</w:t>
       </w:r>
     </w:p>
     <w:p>
       <w:pPr>
-        <w:pStyle w:val="Normal"/>
+        <w:pStyle w:val="Cuerpodetexto"/>
+        <w:numPr>
+          <w:ilvl w:val="0"/>
+          <w:numId w:val="10"/>
+        </w:numPr>
+        <w:tabs>
+          <w:tab w:val="clear" w:pos="720"/>
+          <w:tab w:val="left" w:pos="0" w:leader="none"/>
+        </w:tabs>
+        <w:spacing w:before="0" w:after="0"/>
+        <w:ind w:left="709" w:hanging="283"/>
         <w:rPr>
           <w:rFonts w:ascii="Liberation Serif" w:hAnsi="Liberation Serif"/>
+          <w:b/>
+          <w:b/>
+          <w:bCs/>
+          <w:sz w:val="36"/>
+          <w:szCs w:val="36"/>
           <w:lang w:val="es-ES"/>
         </w:rPr>
       </w:pPr>
       <w:r>
-        <w:rPr>
-          <w:rFonts w:ascii="Liberation Serif" w:hAnsi="Liberation Serif"/>
-          <w:lang w:val="es-ES"/>
-        </w:rPr>
-        <w:t>Coste fundador: 15.300 – 22.800 €</w:t>
+        <w:rPr/>
+        <w:t xml:space="preserve">estabilidad operativa real </w:t>
       </w:r>
     </w:p>
     <w:p>
       <w:pPr>
-        <w:pStyle w:val="Normal"/>
+        <w:pStyle w:val="Cuerpodetexto"/>
+        <w:numPr>
+          <w:ilvl w:val="0"/>
+          <w:numId w:val="10"/>
+        </w:numPr>
+        <w:tabs>
+          <w:tab w:val="clear" w:pos="720"/>
+          <w:tab w:val="left" w:pos="0" w:leader="none"/>
+        </w:tabs>
+        <w:spacing w:before="0" w:after="0"/>
+        <w:ind w:left="709" w:hanging="283"/>
         <w:rPr>
           <w:rFonts w:ascii="Liberation Serif" w:hAnsi="Liberation Serif"/>
+          <w:b/>
+          <w:b/>
+          <w:bCs/>
+          <w:sz w:val="36"/>
+          <w:szCs w:val="36"/>
           <w:lang w:val="es-ES"/>
         </w:rPr>
       </w:pPr>
       <w:r>
-        <w:rPr>
-          <w:rFonts w:ascii="Liberation Serif" w:hAnsi="Liberation Serif"/>
-          <w:lang w:val="es-ES"/>
-        </w:rPr>
-        <w:t>Costes mínimos del proyecto: 1.500 – 2.000 €</w:t>
+        <w:rPr/>
+        <w:t xml:space="preserve">margen de ejecución sin interrupciones </w:t>
       </w:r>
     </w:p>
     <w:p>
       <w:pPr>
-        <w:pStyle w:val="Normal"/>
+        <w:pStyle w:val="Cuerpodetexto"/>
+        <w:numPr>
+          <w:ilvl w:val="0"/>
+          <w:numId w:val="10"/>
+        </w:numPr>
+        <w:tabs>
+          <w:tab w:val="clear" w:pos="720"/>
+          <w:tab w:val="left" w:pos="0" w:leader="none"/>
+        </w:tabs>
+        <w:ind w:left="709" w:hanging="283"/>
         <w:rPr>
           <w:rFonts w:ascii="Liberation Serif" w:hAnsi="Liberation Serif"/>
+          <w:b/>
+          <w:b/>
+          <w:bCs/>
+          <w:sz w:val="36"/>
+          <w:szCs w:val="36"/>
           <w:lang w:val="es-ES"/>
         </w:rPr>
       </w:pPr>
       <w:r>
-        <w:rPr>
-          <w:rFonts w:ascii="Liberation Serif" w:hAnsi="Liberation Serif"/>
-          <w:lang w:val="es-ES"/>
-        </w:rPr>
-        <w:t>Total operativo: 15.000 – 30.000 €</w:t>
+        <w:rPr/>
+        <w:t xml:space="preserve">preparación sólida de solicitud ENISA </w:t>
       </w:r>
     </w:p>
     <w:p>
       <w:pPr>
-        <w:pStyle w:val="Normal"/>
+        <w:pStyle w:val="Lneahorizontal"/>
         <w:rPr>
           <w:rFonts w:ascii="Liberation Serif" w:hAnsi="Liberation Serif"/>
+          <w:b/>
+          <w:b/>
+          <w:bCs/>
+          <w:sz w:val="36"/>
+          <w:szCs w:val="36"/>
           <w:lang w:val="es-ES"/>
         </w:rPr>
       </w:pPr>
       <w:r>
-        <w:rPr>
-          <w:rFonts w:ascii="Liberation Serif" w:hAnsi="Liberation Serif"/>
-          <w:lang w:val="es-ES"/>
-        </w:rPr>
+        <w:rPr/>
       </w:r>
     </w:p>
     <w:p>
       <w:pPr>
-        <w:pStyle w:val="Normal"/>
+        <w:pStyle w:val="Ttulo2"/>
+        <w:spacing w:before="200" w:after="283"/>
         <w:rPr>
           <w:rFonts w:ascii="Liberation Serif" w:hAnsi="Liberation Serif"/>
           <w:b/>
           <w:b/>
           <w:bCs/>
-          <w:sz w:val="28"/>
-          <w:szCs w:val="28"/>
+          <w:sz w:val="36"/>
+          <w:szCs w:val="36"/>
           <w:lang w:val="es-ES"/>
         </w:rPr>
       </w:pPr>
       <w:r>
         <w:rPr>
-          <w:rFonts w:ascii="Liberation Serif" w:hAnsi="Liberation Serif"/>
-          <w:b/>
-          <w:bCs/>
-          <w:sz w:val="28"/>
-          <w:szCs w:val="28"/>
-          <w:lang w:val="es-ES"/>
+          <w:rStyle w:val="Destaquemayor"/>
+          <w:b/>
         </w:rPr>
         <w:t>4. Uso de los fondos</w:t>
       </w:r>
     </w:p>
     <w:p>
       <w:pPr>
-        <w:pStyle w:val="Normal"/>
+        <w:pStyle w:val="Cuerpodetexto"/>
         <w:rPr>
           <w:rFonts w:ascii="Liberation Serif" w:hAnsi="Liberation Serif"/>
+          <w:b/>
+          <w:b/>
+          <w:bCs/>
+          <w:sz w:val="36"/>
+          <w:szCs w:val="36"/>
           <w:lang w:val="es-ES"/>
         </w:rPr>
       </w:pPr>
       <w:r>
-        <w:rPr>
-          <w:rFonts w:ascii="Liberation Serif" w:hAnsi="Liberation Serif"/>
-          <w:lang w:val="es-ES"/>
-        </w:rPr>
+        <w:rPr/>
+        <w:t>Distribución funcional (no contable):</w:t>
       </w:r>
     </w:p>
     <w:p>
       <w:pPr>
-        <w:pStyle w:val="Normal"/>
+        <w:pStyle w:val="Cuerpodetexto"/>
+        <w:numPr>
+          <w:ilvl w:val="0"/>
+          <w:numId w:val="11"/>
+        </w:numPr>
+        <w:tabs>
+          <w:tab w:val="clear" w:pos="720"/>
+          <w:tab w:val="left" w:pos="0" w:leader="none"/>
+        </w:tabs>
+        <w:spacing w:before="0" w:after="0"/>
+        <w:ind w:left="709" w:hanging="283"/>
         <w:rPr>
           <w:rFonts w:ascii="Liberation Serif" w:hAnsi="Liberation Serif"/>
+          <w:b/>
+          <w:b/>
+          <w:bCs/>
+          <w:sz w:val="36"/>
+          <w:szCs w:val="36"/>
           <w:lang w:val="es-ES"/>
         </w:rPr>
       </w:pPr>
       <w:r>
         <w:rPr>
-          <w:rFonts w:ascii="Liberation Serif" w:hAnsi="Liberation Serif"/>
-          <w:lang w:val="es-ES"/>
+          <w:rStyle w:val="Destaquemayor"/>
         </w:rPr>
-        <w:t>- Retribución operativa del fundador</w:t>
+        <w:t>Ejecución técnica (principal)</w:t>
+      </w:r>
+      <w:r>
+        <w:rPr/>
+        <w:t xml:space="preserve"> </w:t>
       </w:r>
     </w:p>
     <w:p>
       <w:pPr>
-        <w:pStyle w:val="Normal"/>
+        <w:pStyle w:val="Cuerpodetexto"/>
+        <w:numPr>
+          <w:ilvl w:val="1"/>
+          <w:numId w:val="11"/>
+        </w:numPr>
+        <w:tabs>
+          <w:tab w:val="clear" w:pos="720"/>
+          <w:tab w:val="left" w:pos="0" w:leader="none"/>
+        </w:tabs>
+        <w:spacing w:before="0" w:after="0"/>
+        <w:ind w:left="1418" w:hanging="283"/>
         <w:rPr>
           <w:rFonts w:ascii="Liberation Serif" w:hAnsi="Liberation Serif"/>
+          <w:b/>
+          <w:b/>
+          <w:bCs/>
+          <w:sz w:val="36"/>
+          <w:szCs w:val="36"/>
           <w:lang w:val="es-ES"/>
         </w:rPr>
       </w:pPr>
       <w:r>
-        <w:rPr>
-          <w:rFonts w:ascii="Liberation Serif" w:hAnsi="Liberation Serif"/>
-          <w:lang w:val="es-ES"/>
-        </w:rPr>
-        <w:t>- Desarrollo continuo del MVP</w:t>
+        <w:rPr/>
+        <w:t xml:space="preserve">desarrollo del núcleo (UMCI + CVA + capa ZeroCog) </w:t>
       </w:r>
     </w:p>
     <w:p>
       <w:pPr>
-        <w:pStyle w:val="Normal"/>
+        <w:pStyle w:val="Cuerpodetexto"/>
+        <w:numPr>
+          <w:ilvl w:val="0"/>
+          <w:numId w:val="11"/>
+        </w:numPr>
+        <w:tabs>
+          <w:tab w:val="clear" w:pos="720"/>
+          <w:tab w:val="left" w:pos="0" w:leader="none"/>
+        </w:tabs>
+        <w:spacing w:before="0" w:after="0"/>
+        <w:ind w:left="709" w:hanging="283"/>
         <w:rPr>
           <w:rFonts w:ascii="Liberation Serif" w:hAnsi="Liberation Serif"/>
+          <w:b/>
+          <w:b/>
+          <w:bCs/>
+          <w:sz w:val="36"/>
+          <w:szCs w:val="36"/>
           <w:lang w:val="es-ES"/>
         </w:rPr>
       </w:pPr>
       <w:r>
         <w:rPr>
-          <w:rFonts w:ascii="Liberation Serif" w:hAnsi="Liberation Serif"/>
-          <w:lang w:val="es-ES"/>
+          <w:rStyle w:val="Destaquemayor"/>
         </w:rPr>
-        <w:t>- Infraestructura y herramientas básicas</w:t>
+        <w:t>Sostenibilidad operativa</w:t>
+      </w:r>
+      <w:r>
+        <w:rPr/>
+        <w:t xml:space="preserve"> </w:t>
       </w:r>
     </w:p>
     <w:p>
       <w:pPr>
-        <w:pStyle w:val="Normal"/>
+        <w:pStyle w:val="Cuerpodetexto"/>
+        <w:numPr>
+          <w:ilvl w:val="1"/>
+          <w:numId w:val="11"/>
+        </w:numPr>
+        <w:tabs>
+          <w:tab w:val="clear" w:pos="720"/>
+          <w:tab w:val="left" w:pos="0" w:leader="none"/>
+        </w:tabs>
+        <w:spacing w:before="0" w:after="0"/>
+        <w:ind w:left="1418" w:hanging="283"/>
         <w:rPr>
           <w:rFonts w:ascii="Liberation Serif" w:hAnsi="Liberation Serif"/>
+          <w:b/>
+          <w:b/>
+          <w:bCs/>
+          <w:sz w:val="36"/>
+          <w:szCs w:val="36"/>
           <w:lang w:val="es-ES"/>
         </w:rPr>
       </w:pPr>
       <w:r>
-        <w:rPr>
-          <w:rFonts w:ascii="Liberation Serif" w:hAnsi="Liberation Serif"/>
-          <w:lang w:val="es-ES"/>
-        </w:rPr>
-        <w:t>- Preparación de procesos de financiación</w:t>
+        <w:rPr/>
+        <w:t xml:space="preserve">dedicación exclusiva del fundador </w:t>
       </w:r>
     </w:p>
     <w:p>
       <w:pPr>
-        <w:pStyle w:val="Normal"/>
+        <w:pStyle w:val="Cuerpodetexto"/>
+        <w:numPr>
+          <w:ilvl w:val="0"/>
+          <w:numId w:val="11"/>
+        </w:numPr>
+        <w:tabs>
+          <w:tab w:val="clear" w:pos="720"/>
+          <w:tab w:val="left" w:pos="0" w:leader="none"/>
+        </w:tabs>
+        <w:spacing w:before="0" w:after="0"/>
+        <w:ind w:left="709" w:hanging="283"/>
         <w:rPr>
           <w:rFonts w:ascii="Liberation Serif" w:hAnsi="Liberation Serif"/>
+          <w:b/>
+          <w:b/>
+          <w:bCs/>
+          <w:sz w:val="36"/>
+          <w:szCs w:val="36"/>
           <w:lang w:val="es-ES"/>
         </w:rPr>
       </w:pPr>
       <w:r>
         <w:rPr>
-          <w:rFonts w:ascii="Liberation Serif" w:hAnsi="Liberation Serif"/>
-          <w:lang w:val="es-ES"/>
+          <w:rStyle w:val="Destaquemayor"/>
         </w:rPr>
+        <w:t>Infraestructura mínima</w:t>
+      </w:r>
+      <w:r>
+        <w:rPr/>
+        <w:t xml:space="preserve"> </w:t>
       </w:r>
     </w:p>
     <w:p>
       <w:pPr>
-        <w:pStyle w:val="Normal"/>
+        <w:pStyle w:val="Cuerpodetexto"/>
+        <w:numPr>
+          <w:ilvl w:val="1"/>
+          <w:numId w:val="11"/>
+        </w:numPr>
+        <w:tabs>
+          <w:tab w:val="clear" w:pos="720"/>
+          <w:tab w:val="left" w:pos="0" w:leader="none"/>
+        </w:tabs>
+        <w:spacing w:before="0" w:after="0"/>
+        <w:ind w:left="1418" w:hanging="283"/>
         <w:rPr>
           <w:rFonts w:ascii="Liberation Serif" w:hAnsi="Liberation Serif"/>
           <w:b/>
           <w:b/>
           <w:bCs/>
-          <w:sz w:val="28"/>
-          <w:szCs w:val="28"/>
+          <w:sz w:val="36"/>
+          <w:szCs w:val="36"/>
           <w:lang w:val="es-ES"/>
         </w:rPr>
       </w:pPr>
       <w:r>
-        <w:rPr>
-          <w:rFonts w:ascii="Liberation Serif" w:hAnsi="Liberation Serif"/>
-          <w:b/>
-          <w:bCs/>
-          <w:sz w:val="28"/>
-          <w:szCs w:val="28"/>
-          <w:lang w:val="es-ES"/>
-        </w:rPr>
-        <w:t>5. Estrategia de desarrollo y financiación</w:t>
+        <w:rPr/>
+        <w:t xml:space="preserve">entorno de desarrollo y pruebas </w:t>
       </w:r>
     </w:p>
     <w:p>
       <w:pPr>
-        <w:pStyle w:val="Normal"/>
+        <w:pStyle w:val="Cuerpodetexto"/>
+        <w:numPr>
+          <w:ilvl w:val="0"/>
+          <w:numId w:val="11"/>
+        </w:numPr>
+        <w:tabs>
+          <w:tab w:val="clear" w:pos="720"/>
+          <w:tab w:val="left" w:pos="0" w:leader="none"/>
+        </w:tabs>
+        <w:spacing w:before="0" w:after="0"/>
+        <w:ind w:left="709" w:hanging="283"/>
         <w:rPr>
           <w:rFonts w:ascii="Liberation Serif" w:hAnsi="Liberation Serif"/>
+          <w:b/>
+          <w:b/>
+          <w:bCs/>
+          <w:sz w:val="36"/>
+          <w:szCs w:val="36"/>
           <w:lang w:val="es-ES"/>
         </w:rPr>
       </w:pPr>
       <w:r>
         <w:rPr>
-          <w:rFonts w:ascii="Liberation Serif" w:hAnsi="Liberation Serif"/>
-          <w:lang w:val="es-ES"/>
+          <w:rStyle w:val="Destaquemayor"/>
         </w:rPr>
+        <w:t>Preparación ENISA</w:t>
+      </w:r>
+      <w:r>
+        <w:rPr/>
+        <w:t xml:space="preserve"> </w:t>
       </w:r>
     </w:p>
     <w:p>
       <w:pPr>
-        <w:pStyle w:val="Normal"/>
+        <w:pStyle w:val="Cuerpodetexto"/>
+        <w:numPr>
+          <w:ilvl w:val="1"/>
+          <w:numId w:val="11"/>
+        </w:numPr>
+        <w:tabs>
+          <w:tab w:val="clear" w:pos="720"/>
+          <w:tab w:val="left" w:pos="0" w:leader="none"/>
+        </w:tabs>
+        <w:spacing w:before="0" w:after="0"/>
+        <w:ind w:left="1418" w:hanging="283"/>
         <w:rPr>
           <w:rFonts w:ascii="Liberation Serif" w:hAnsi="Liberation Serif"/>
           <w:b/>
           <w:b/>
           <w:bCs/>
+          <w:sz w:val="36"/>
+          <w:szCs w:val="36"/>
           <w:lang w:val="es-ES"/>
         </w:rPr>
       </w:pPr>
       <w:r>
-        <w:rPr>
-          <w:rFonts w:ascii="Liberation Serif" w:hAnsi="Liberation Serif"/>
-          <w:b/>
-          <w:bCs/>
-          <w:lang w:val="es-ES"/>
-        </w:rPr>
-        <w:t>Fase 1 — Activación operativa</w:t>
+        <w:rPr/>
+        <w:t xml:space="preserve">documentación técnica </w:t>
       </w:r>
     </w:p>
     <w:p>
       <w:pPr>
-        <w:pStyle w:val="Normal"/>
+        <w:pStyle w:val="Cuerpodetexto"/>
+        <w:numPr>
+          <w:ilvl w:val="1"/>
+          <w:numId w:val="11"/>
+        </w:numPr>
+        <w:tabs>
+          <w:tab w:val="clear" w:pos="720"/>
+          <w:tab w:val="left" w:pos="0" w:leader="none"/>
+        </w:tabs>
+        <w:spacing w:before="0" w:after="0"/>
+        <w:ind w:left="1418" w:hanging="283"/>
         <w:rPr>
           <w:rFonts w:ascii="Liberation Serif" w:hAnsi="Liberation Serif"/>
+          <w:b/>
+          <w:b/>
+          <w:bCs/>
+          <w:sz w:val="36"/>
+          <w:szCs w:val="36"/>
           <w:lang w:val="es-ES"/>
         </w:rPr>
       </w:pPr>
       <w:r>
-        <w:rPr>
-          <w:rFonts w:ascii="Liberation Serif" w:hAnsi="Liberation Serif"/>
-          <w:lang w:val="es-ES"/>
-        </w:rPr>
-        <w:t>- Inversión inicial (15k–30k)</w:t>
+        <w:rPr/>
+        <w:t xml:space="preserve">estructuración del proyecto </w:t>
       </w:r>
     </w:p>
     <w:p>
       <w:pPr>
-        <w:pStyle w:val="Normal"/>
+        <w:pStyle w:val="Cuerpodetexto"/>
+        <w:numPr>
+          <w:ilvl w:val="1"/>
+          <w:numId w:val="11"/>
+        </w:numPr>
+        <w:tabs>
+          <w:tab w:val="clear" w:pos="720"/>
+          <w:tab w:val="left" w:pos="0" w:leader="none"/>
+        </w:tabs>
+        <w:ind w:left="1418" w:hanging="283"/>
         <w:rPr>
           <w:rFonts w:ascii="Liberation Serif" w:hAnsi="Liberation Serif"/>
+          <w:b/>
+          <w:b/>
+          <w:bCs/>
+          <w:sz w:val="36"/>
+          <w:szCs w:val="36"/>
           <w:lang w:val="es-ES"/>
         </w:rPr>
       </w:pPr>
       <w:r>
-        <w:rPr>
-          <w:rFonts w:ascii="Liberation Serif" w:hAnsi="Liberation Serif"/>
-          <w:lang w:val="es-ES"/>
-        </w:rPr>
-        <w:t>- Dedicación exclusiva</w:t>
+        <w:rPr/>
+        <w:t xml:space="preserve">validación previa </w:t>
       </w:r>
     </w:p>
     <w:p>
       <w:pPr>
-        <w:pStyle w:val="Normal"/>
+        <w:pStyle w:val="Cuerpodetexto"/>
         <w:rPr>
           <w:rFonts w:ascii="Liberation Serif" w:hAnsi="Liberation Serif"/>
+          <w:b/>
+          <w:b/>
+          <w:bCs/>
+          <w:sz w:val="36"/>
+          <w:szCs w:val="36"/>
           <w:lang w:val="es-ES"/>
         </w:rPr>
       </w:pPr>
       <w:r>
-        <w:rPr>
-          <w:rFonts w:ascii="Liberation Serif" w:hAnsi="Liberation Serif"/>
-          <w:lang w:val="es-ES"/>
-        </w:rPr>
-        <w:t>- Desarrollo continuo del producto</w:t>
+        <w:rPr/>
+        <w:t>No se contempla:</w:t>
       </w:r>
     </w:p>
     <w:p>
       <w:pPr>
-        <w:pStyle w:val="Normal"/>
+        <w:pStyle w:val="Cuerpodetexto"/>
+        <w:numPr>
+          <w:ilvl w:val="0"/>
+          <w:numId w:val="12"/>
+        </w:numPr>
+        <w:tabs>
+          <w:tab w:val="clear" w:pos="720"/>
+          <w:tab w:val="left" w:pos="0" w:leader="none"/>
+        </w:tabs>
+        <w:spacing w:before="0" w:after="0"/>
+        <w:ind w:left="709" w:hanging="283"/>
         <w:rPr>
           <w:rFonts w:ascii="Liberation Serif" w:hAnsi="Liberation Serif"/>
+          <w:b/>
+          <w:b/>
+          <w:bCs/>
+          <w:sz w:val="36"/>
+          <w:szCs w:val="36"/>
           <w:lang w:val="es-ES"/>
         </w:rPr>
       </w:pPr>
       <w:r>
-        <w:rPr>
-          <w:rFonts w:ascii="Liberation Serif" w:hAnsi="Liberation Serif"/>
-          <w:lang w:val="es-ES"/>
-        </w:rPr>
+        <w:rPr/>
+        <w:t xml:space="preserve">marketing </w:t>
       </w:r>
     </w:p>
     <w:p>
       <w:pPr>
-        <w:pStyle w:val="Normal"/>
+        <w:pStyle w:val="Cuerpodetexto"/>
+        <w:numPr>
+          <w:ilvl w:val="0"/>
+          <w:numId w:val="12"/>
+        </w:numPr>
+        <w:tabs>
+          <w:tab w:val="clear" w:pos="720"/>
+          <w:tab w:val="left" w:pos="0" w:leader="none"/>
+        </w:tabs>
+        <w:spacing w:before="0" w:after="0"/>
+        <w:ind w:left="709" w:hanging="283"/>
         <w:rPr>
           <w:rFonts w:ascii="Liberation Serif" w:hAnsi="Liberation Serif"/>
           <w:b/>
           <w:b/>
           <w:bCs/>
+          <w:sz w:val="36"/>
+          <w:szCs w:val="36"/>
           <w:lang w:val="es-ES"/>
         </w:rPr>
       </w:pPr>
       <w:r>
-        <w:rPr>
-          <w:rFonts w:ascii="Liberation Serif" w:hAnsi="Liberation Serif"/>
-          <w:b/>
-          <w:bCs/>
-          <w:lang w:val="es-ES"/>
-        </w:rPr>
-        <w:t>Fase 2 — Validación y ampliación de capital</w:t>
+        <w:rPr/>
+        <w:t xml:space="preserve">expansión prematura </w:t>
       </w:r>
     </w:p>
     <w:p>
       <w:pPr>
-        <w:pStyle w:val="Normal"/>
+        <w:pStyle w:val="Cuerpodetexto"/>
+        <w:numPr>
+          <w:ilvl w:val="0"/>
+          <w:numId w:val="12"/>
+        </w:numPr>
+        <w:tabs>
+          <w:tab w:val="clear" w:pos="720"/>
+          <w:tab w:val="left" w:pos="0" w:leader="none"/>
+        </w:tabs>
+        <w:ind w:left="709" w:hanging="283"/>
         <w:rPr>
           <w:rFonts w:ascii="Liberation Serif" w:hAnsi="Liberation Serif"/>
+          <w:b/>
+          <w:b/>
+          <w:bCs/>
+          <w:sz w:val="36"/>
+          <w:szCs w:val="36"/>
           <w:lang w:val="es-ES"/>
         </w:rPr>
       </w:pPr>
       <w:r>
-        <w:rPr>
-          <w:rFonts w:ascii="Liberation Serif" w:hAnsi="Liberation Serif"/>
-          <w:lang w:val="es-ES"/>
-        </w:rPr>
-        <w:t>- Mejora progresiva del MVP</w:t>
+        <w:rPr/>
+        <w:t xml:space="preserve">contratación temprana </w:t>
       </w:r>
     </w:p>
     <w:p>
       <w:pPr>
-        <w:pStyle w:val="Normal"/>
+        <w:pStyle w:val="Lneahorizontal"/>
         <w:rPr>
           <w:rFonts w:ascii="Liberation Serif" w:hAnsi="Liberation Serif"/>
+          <w:b/>
+          <w:b/>
+          <w:bCs/>
+          <w:sz w:val="36"/>
+          <w:szCs w:val="36"/>
           <w:lang w:val="es-ES"/>
         </w:rPr>
       </w:pPr>
       <w:r>
-        <w:rPr>
-          <w:rFonts w:ascii="Liberation Serif" w:hAnsi="Liberation Serif"/>
-          <w:lang w:val="es-ES"/>
-        </w:rPr>
-        <w:t>- Incremento de calidad de demo y materiales</w:t>
+        <w:rPr/>
       </w:r>
     </w:p>
     <w:p>
       <w:pPr>
-        <w:pStyle w:val="Normal"/>
+        <w:pStyle w:val="Ttulo2"/>
+        <w:spacing w:before="200" w:after="283"/>
         <w:rPr>
           <w:rFonts w:ascii="Liberation Serif" w:hAnsi="Liberation Serif"/>
+          <w:b/>
+          <w:b/>
+          <w:bCs/>
+          <w:sz w:val="36"/>
+          <w:szCs w:val="36"/>
           <w:lang w:val="es-ES"/>
         </w:rPr>
       </w:pPr>
       <w:r>
         <w:rPr>
-          <w:rFonts w:ascii="Liberation Serif" w:hAnsi="Liberation Serif"/>
-          <w:lang w:val="es-ES"/>
+          <w:rStyle w:val="Destaquemayor"/>
+          <w:b/>
         </w:rPr>
-        <w:t>- Captación de nuevos inversores en tickets reducidos</w:t>
+        <w:t>5. Estrategia de financiación</w:t>
       </w:r>
     </w:p>
     <w:p>
       <w:pPr>
-        <w:pStyle w:val="Normal"/>
+        <w:pStyle w:val="Ttulo3"/>
+        <w:spacing w:before="200" w:after="283"/>
         <w:rPr>
           <w:rFonts w:ascii="Liberation Serif" w:hAnsi="Liberation Serif"/>
+          <w:b/>
+          <w:b/>
+          <w:bCs/>
+          <w:sz w:val="36"/>
+          <w:szCs w:val="36"/>
           <w:lang w:val="es-ES"/>
         </w:rPr>
       </w:pPr>
       <w:r>
         <w:rPr>
-          <w:rFonts w:ascii="Liberation Serif" w:hAnsi="Liberation Serif"/>
-          <w:lang w:val="es-ES"/>
+          <w:rStyle w:val="Destaquemayor"/>
+          <w:b/>
         </w:rPr>
-        <w:t>- Ampliaciones de capital sucesivas o alternativas</w:t>
+        <w:t>Fase actual — Puente</w:t>
       </w:r>
     </w:p>
     <w:p>
       <w:pPr>
-        <w:pStyle w:val="Normal"/>
+        <w:pStyle w:val="Cuerpodetexto"/>
+        <w:numPr>
+          <w:ilvl w:val="0"/>
+          <w:numId w:val="13"/>
+        </w:numPr>
+        <w:tabs>
+          <w:tab w:val="clear" w:pos="720"/>
+          <w:tab w:val="left" w:pos="0" w:leader="none"/>
+        </w:tabs>
+        <w:spacing w:before="0" w:after="0"/>
+        <w:ind w:left="709" w:hanging="283"/>
         <w:rPr>
           <w:rFonts w:ascii="Liberation Serif" w:hAnsi="Liberation Serif"/>
+          <w:b/>
+          <w:b/>
+          <w:bCs/>
+          <w:sz w:val="36"/>
+          <w:szCs w:val="36"/>
           <w:lang w:val="es-ES"/>
         </w:rPr>
       </w:pPr>
       <w:r>
-        <w:rPr>
-          <w:rFonts w:ascii="Liberation Serif" w:hAnsi="Liberation Serif"/>
-          <w:lang w:val="es-ES"/>
-        </w:rPr>
+        <w:rPr/>
+        <w:t xml:space="preserve">capital privado reducido (30k–60k) </w:t>
       </w:r>
     </w:p>
     <w:p>
       <w:pPr>
-        <w:pStyle w:val="Normal"/>
+        <w:pStyle w:val="Cuerpodetexto"/>
+        <w:numPr>
+          <w:ilvl w:val="0"/>
+          <w:numId w:val="13"/>
+        </w:numPr>
+        <w:tabs>
+          <w:tab w:val="clear" w:pos="720"/>
+          <w:tab w:val="left" w:pos="0" w:leader="none"/>
+        </w:tabs>
+        <w:spacing w:before="0" w:after="0"/>
+        <w:ind w:left="709" w:hanging="283"/>
         <w:rPr>
           <w:rFonts w:ascii="Liberation Serif" w:hAnsi="Liberation Serif"/>
           <w:b/>
           <w:b/>
           <w:bCs/>
+          <w:sz w:val="36"/>
+          <w:szCs w:val="36"/>
           <w:lang w:val="es-ES"/>
         </w:rPr>
       </w:pPr>
       <w:r>
-        <w:rPr>
-          <w:rFonts w:ascii="Liberation Serif" w:hAnsi="Liberation Serif"/>
-          <w:b/>
-          <w:bCs/>
-          <w:lang w:val="es-ES"/>
-        </w:rPr>
-        <w:t>Fase 3 — Financiación estructurada</w:t>
+        <w:rPr/>
+        <w:t xml:space="preserve">ejecución concentrada </w:t>
       </w:r>
     </w:p>
     <w:p>
       <w:pPr>
-        <w:pStyle w:val="Normal"/>
+        <w:pStyle w:val="Cuerpodetexto"/>
+        <w:numPr>
+          <w:ilvl w:val="0"/>
+          <w:numId w:val="13"/>
+        </w:numPr>
+        <w:tabs>
+          <w:tab w:val="clear" w:pos="720"/>
+          <w:tab w:val="left" w:pos="0" w:leader="none"/>
+        </w:tabs>
+        <w:ind w:left="709" w:hanging="283"/>
         <w:rPr>
           <w:rFonts w:ascii="Liberation Serif" w:hAnsi="Liberation Serif"/>
+          <w:b/>
+          <w:b/>
+          <w:bCs/>
+          <w:sz w:val="36"/>
+          <w:szCs w:val="36"/>
           <w:lang w:val="es-ES"/>
         </w:rPr>
       </w:pPr>
       <w:r>
-        <w:rPr>
-          <w:rFonts w:ascii="Liberation Serif" w:hAnsi="Liberation Serif"/>
-          <w:lang w:val="es-ES"/>
-        </w:rPr>
-        <w:t>- Acceso a financiación pública (ENISA, ICO)</w:t>
+        <w:rPr/>
+        <w:t xml:space="preserve">validación técnica progresiva </w:t>
       </w:r>
     </w:p>
     <w:p>
       <w:pPr>
-        <w:pStyle w:val="Normal"/>
+        <w:pStyle w:val="Lneahorizontal"/>
         <w:rPr>
           <w:rFonts w:ascii="Liberation Serif" w:hAnsi="Liberation Serif"/>
+          <w:b/>
+          <w:b/>
+          <w:bCs/>
+          <w:sz w:val="36"/>
+          <w:szCs w:val="36"/>
           <w:lang w:val="es-ES"/>
         </w:rPr>
       </w:pPr>
       <w:r>
-        <w:rPr>
-          <w:rFonts w:ascii="Liberation Serif" w:hAnsi="Liberation Serif"/>
-          <w:lang w:val="es-ES"/>
-        </w:rPr>
-        <w:t>- Entrada de capital institucional</w:t>
+        <w:rPr/>
       </w:r>
     </w:p>
     <w:p>
       <w:pPr>
-        <w:pStyle w:val="Normal"/>
+        <w:pStyle w:val="Ttulo3"/>
+        <w:spacing w:before="200" w:after="283"/>
         <w:rPr>
           <w:rFonts w:ascii="Liberation Serif" w:hAnsi="Liberation Serif"/>
+          <w:b/>
+          <w:b/>
+          <w:bCs/>
+          <w:sz w:val="36"/>
+          <w:szCs w:val="36"/>
           <w:lang w:val="es-ES"/>
         </w:rPr>
       </w:pPr>
       <w:r>
         <w:rPr>
-          <w:rFonts w:ascii="Liberation Serif" w:hAnsi="Liberation Serif"/>
-          <w:lang w:val="es-ES"/>
+          <w:rStyle w:val="Destaquemayor"/>
+          <w:b/>
         </w:rPr>
-        <w:t>- Ampliación de equipo técnico</w:t>
+        <w:t>Siguiente fase — ENISA</w:t>
       </w:r>
     </w:p>
     <w:p>
       <w:pPr>
-        <w:pStyle w:val="Normal"/>
+        <w:pStyle w:val="Cuerpodetexto"/>
+        <w:numPr>
+          <w:ilvl w:val="0"/>
+          <w:numId w:val="14"/>
+        </w:numPr>
+        <w:tabs>
+          <w:tab w:val="clear" w:pos="720"/>
+          <w:tab w:val="left" w:pos="0" w:leader="none"/>
+        </w:tabs>
+        <w:spacing w:before="0" w:after="0"/>
+        <w:ind w:left="709" w:hanging="283"/>
         <w:rPr>
           <w:rFonts w:ascii="Liberation Serif" w:hAnsi="Liberation Serif"/>
+          <w:b/>
+          <w:b/>
+          <w:bCs/>
+          <w:sz w:val="36"/>
+          <w:szCs w:val="36"/>
           <w:lang w:val="es-ES"/>
         </w:rPr>
       </w:pPr>
       <w:r>
-        <w:rPr>
-          <w:rFonts w:ascii="Liberation Serif" w:hAnsi="Liberation Serif"/>
-          <w:lang w:val="es-ES"/>
-        </w:rPr>
+        <w:rPr/>
+        <w:t xml:space="preserve">financiación pública estructurada </w:t>
       </w:r>
     </w:p>
     <w:p>
       <w:pPr>
-        <w:pStyle w:val="Normal"/>
+        <w:pStyle w:val="Cuerpodetexto"/>
+        <w:numPr>
+          <w:ilvl w:val="0"/>
+          <w:numId w:val="14"/>
+        </w:numPr>
+        <w:tabs>
+          <w:tab w:val="clear" w:pos="720"/>
+          <w:tab w:val="left" w:pos="0" w:leader="none"/>
+        </w:tabs>
+        <w:spacing w:before="0" w:after="0"/>
+        <w:ind w:left="709" w:hanging="283"/>
         <w:rPr>
           <w:rFonts w:ascii="Liberation Serif" w:hAnsi="Liberation Serif"/>
           <w:b/>
           <w:b/>
           <w:bCs/>
-          <w:sz w:val="28"/>
-          <w:szCs w:val="28"/>
+          <w:sz w:val="36"/>
+          <w:szCs w:val="36"/>
           <w:lang w:val="es-ES"/>
         </w:rPr>
       </w:pPr>
       <w:r>
-        <w:rPr>
-          <w:rFonts w:ascii="Liberation Serif" w:hAnsi="Liberation Serif"/>
-          <w:b/>
-          <w:bCs/>
-          <w:sz w:val="28"/>
-          <w:szCs w:val="28"/>
-          <w:lang w:val="es-ES"/>
-        </w:rPr>
-        <w:t>6. Hitos previstos</w:t>
+        <w:rPr/>
+        <w:t xml:space="preserve">ampliación de capacidad técnica </w:t>
       </w:r>
     </w:p>
     <w:p>
       <w:pPr>
-        <w:pStyle w:val="Normal"/>
+        <w:pStyle w:val="Cuerpodetexto"/>
+        <w:numPr>
+          <w:ilvl w:val="0"/>
+          <w:numId w:val="14"/>
+        </w:numPr>
+        <w:tabs>
+          <w:tab w:val="clear" w:pos="720"/>
+          <w:tab w:val="left" w:pos="0" w:leader="none"/>
+        </w:tabs>
+        <w:ind w:left="709" w:hanging="283"/>
         <w:rPr>
           <w:rFonts w:ascii="Liberation Serif" w:hAnsi="Liberation Serif"/>
+          <w:b/>
+          <w:b/>
+          <w:bCs/>
+          <w:sz w:val="36"/>
+          <w:szCs w:val="36"/>
           <w:lang w:val="es-ES"/>
         </w:rPr>
       </w:pPr>
       <w:r>
-        <w:rPr>
-          <w:rFonts w:ascii="Liberation Serif" w:hAnsi="Liberation Serif"/>
-          <w:lang w:val="es-ES"/>
-        </w:rPr>
+        <w:rPr/>
+        <w:t xml:space="preserve">consolidación del proyecto </w:t>
       </w:r>
     </w:p>
     <w:p>
       <w:pPr>
-        <w:pStyle w:val="Normal"/>
+        <w:pStyle w:val="Lneahorizontal"/>
         <w:rPr>
           <w:rFonts w:ascii="Liberation Serif" w:hAnsi="Liberation Serif"/>
+          <w:b/>
+          <w:b/>
+          <w:bCs/>
+          <w:sz w:val="36"/>
+          <w:szCs w:val="36"/>
           <w:lang w:val="es-ES"/>
         </w:rPr>
       </w:pPr>
       <w:r>
-        <w:rPr>
-          <w:rFonts w:ascii="Liberation Serif" w:hAnsi="Liberation Serif"/>
-          <w:lang w:val="es-ES"/>
-        </w:rPr>
-        <w:t>Mes 1: Activación operativa</w:t>
+        <w:rPr/>
       </w:r>
     </w:p>
     <w:p>
       <w:pPr>
-        <w:pStyle w:val="Normal"/>
+        <w:pStyle w:val="Ttulo3"/>
+        <w:spacing w:before="200" w:after="283"/>
         <w:rPr>
           <w:rFonts w:ascii="Liberation Serif" w:hAnsi="Liberation Serif"/>
+          <w:b/>
+          <w:b/>
+          <w:bCs/>
+          <w:sz w:val="36"/>
+          <w:szCs w:val="36"/>
           <w:lang w:val="es-ES"/>
         </w:rPr>
       </w:pPr>
       <w:r>
         <w:rPr>
-          <w:rFonts w:ascii="Liberation Serif" w:hAnsi="Liberation Serif"/>
-          <w:lang w:val="es-ES"/>
+          <w:rStyle w:val="Destaquemayor"/>
+          <w:b/>
         </w:rPr>
-        <w:t>Mes 2–3: Desarrollo inicial del MVP</w:t>
+        <w:t>Fase posterior</w:t>
       </w:r>
     </w:p>
     <w:p>
       <w:pPr>
-        <w:pStyle w:val="Normal"/>
+        <w:pStyle w:val="Cuerpodetexto"/>
+        <w:numPr>
+          <w:ilvl w:val="0"/>
+          <w:numId w:val="15"/>
+        </w:numPr>
+        <w:tabs>
+          <w:tab w:val="clear" w:pos="720"/>
+          <w:tab w:val="left" w:pos="0" w:leader="none"/>
+        </w:tabs>
+        <w:spacing w:before="0" w:after="0"/>
+        <w:ind w:left="709" w:hanging="283"/>
         <w:rPr>
           <w:rFonts w:ascii="Liberation Serif" w:hAnsi="Liberation Serif"/>
+          <w:b/>
+          <w:b/>
+          <w:bCs/>
+          <w:sz w:val="36"/>
+          <w:szCs w:val="36"/>
           <w:lang w:val="es-ES"/>
         </w:rPr>
       </w:pPr>
       <w:r>
-        <w:rPr>
-          <w:rFonts w:ascii="Liberation Serif" w:hAnsi="Liberation Serif"/>
-          <w:lang w:val="es-ES"/>
-        </w:rPr>
-        <w:t>Mes 4–6: MVP funcional</w:t>
+        <w:rPr/>
+        <w:t xml:space="preserve">entrada de capital adicional </w:t>
       </w:r>
     </w:p>
     <w:p>
       <w:pPr>
-        <w:pStyle w:val="Normal"/>
+        <w:pStyle w:val="Cuerpodetexto"/>
+        <w:numPr>
+          <w:ilvl w:val="0"/>
+          <w:numId w:val="15"/>
+        </w:numPr>
+        <w:tabs>
+          <w:tab w:val="clear" w:pos="720"/>
+          <w:tab w:val="left" w:pos="0" w:leader="none"/>
+        </w:tabs>
+        <w:spacing w:before="0" w:after="0"/>
+        <w:ind w:left="709" w:hanging="283"/>
         <w:rPr>
           <w:rFonts w:ascii="Liberation Serif" w:hAnsi="Liberation Serif"/>
+          <w:b/>
+          <w:b/>
+          <w:bCs/>
+          <w:sz w:val="36"/>
+          <w:szCs w:val="36"/>
           <w:lang w:val="es-ES"/>
         </w:rPr>
       </w:pPr>
       <w:r>
-        <w:rPr>
-          <w:rFonts w:ascii="Liberation Serif" w:hAnsi="Liberation Serif"/>
-          <w:lang w:val="es-ES"/>
-        </w:rPr>
-        <w:t>Mes 6–9: Validación técnica y mejora del producto</w:t>
+        <w:rPr/>
+        <w:t xml:space="preserve">crecimiento controlado </w:t>
       </w:r>
     </w:p>
     <w:p>
       <w:pPr>
-        <w:pStyle w:val="Normal"/>
+        <w:pStyle w:val="Cuerpodetexto"/>
+        <w:numPr>
+          <w:ilvl w:val="0"/>
+          <w:numId w:val="15"/>
+        </w:numPr>
+        <w:tabs>
+          <w:tab w:val="clear" w:pos="720"/>
+          <w:tab w:val="left" w:pos="0" w:leader="none"/>
+        </w:tabs>
+        <w:ind w:left="709" w:hanging="283"/>
         <w:rPr>
           <w:rFonts w:ascii="Liberation Serif" w:hAnsi="Liberation Serif"/>
+          <w:b/>
+          <w:b/>
+          <w:bCs/>
+          <w:sz w:val="36"/>
+          <w:szCs w:val="36"/>
           <w:lang w:val="es-ES"/>
         </w:rPr>
       </w:pPr>
       <w:r>
-        <w:rPr>
-          <w:rFonts w:ascii="Liberation Serif" w:hAnsi="Liberation Serif"/>
-          <w:lang w:val="es-ES"/>
-        </w:rPr>
-        <w:t>Mes 9–12: Acceso a financiación adicional</w:t>
+        <w:rPr/>
+        <w:t xml:space="preserve">despliegue en entornos reales </w:t>
       </w:r>
     </w:p>
     <w:p>
       <w:pPr>
-        <w:pStyle w:val="Normal"/>
+        <w:pStyle w:val="Lneahorizontal"/>
         <w:rPr>
           <w:rFonts w:ascii="Liberation Serif" w:hAnsi="Liberation Serif"/>
+          <w:b/>
+          <w:b/>
+          <w:bCs/>
+          <w:sz w:val="36"/>
+          <w:szCs w:val="36"/>
           <w:lang w:val="es-ES"/>
         </w:rPr>
       </w:pPr>
       <w:r>
-        <w:rPr>
-          <w:rFonts w:ascii="Liberation Serif" w:hAnsi="Liberation Serif"/>
-          <w:lang w:val="es-ES"/>
-        </w:rPr>
+        <w:rPr/>
       </w:r>
     </w:p>
     <w:p>
       <w:pPr>
-        <w:pStyle w:val="Normal"/>
+        <w:pStyle w:val="Ttulo2"/>
+        <w:spacing w:before="200" w:after="283"/>
         <w:rPr>
           <w:rFonts w:ascii="Liberation Serif" w:hAnsi="Liberation Serif"/>
           <w:b/>
           <w:b/>
           <w:bCs/>
-          <w:sz w:val="28"/>
-          <w:szCs w:val="28"/>
+          <w:sz w:val="36"/>
+          <w:szCs w:val="36"/>
           <w:lang w:val="es-ES"/>
         </w:rPr>
       </w:pPr>
       <w:r>
         <w:rPr>
-          <w:rFonts w:ascii="Liberation Serif" w:hAnsi="Liberation Serif"/>
-          <w:b/>
-          <w:bCs/>
-          <w:sz w:val="28"/>
-          <w:szCs w:val="28"/>
-          <w:lang w:val="es-ES"/>
+          <w:rStyle w:val="Destaquemayor"/>
+          <w:b/>
         </w:rPr>
-        <w:t>7. Propuesta de inversión</w:t>
+        <w:t>6. Hitos clave</w:t>
       </w:r>
     </w:p>
     <w:p>
       <w:pPr>
-        <w:pStyle w:val="Normal"/>
+        <w:sectPr>
+          <w:type w:val="continuous"/>
+          <w:pgSz w:w="12240" w:h="15840"/>
+          <w:pgMar w:left="1800" w:right="1800" w:gutter="0" w:header="0" w:top="1440" w:footer="0" w:bottom="1440"/>
+          <w:pgNumType w:fmt="decimal"/>
+          <w:formProt w:val="false"/>
+          <w:textDirection w:val="lrTb"/>
+          <w:docGrid w:type="default" w:linePitch="360" w:charSpace="4096"/>
+        </w:sectPr>
+      </w:pPr>
+    </w:p>
+    <w:p>
+      <w:pPr>
+        <w:pStyle w:val="Textopreformateado"/>
         <w:rPr>
           <w:rFonts w:ascii="Liberation Serif" w:hAnsi="Liberation Serif"/>
+          <w:b/>
+          <w:b/>
+          <w:bCs/>
+          <w:sz w:val="36"/>
+          <w:szCs w:val="36"/>
           <w:lang w:val="es-ES"/>
         </w:rPr>
       </w:pPr>
+      <w:bookmarkStart w:id="1" w:name="code-block-viewer_Copy_1"/>
+      <w:bookmarkEnd w:id="1"/>
       <w:r>
-        <w:rPr>
-          <w:rFonts w:ascii="Liberation Serif" w:hAnsi="Liberation Serif"/>
-          <w:lang w:val="es-ES"/>
-        </w:rPr>
+        <w:rPr/>
+        <w:t xml:space="preserve">Mes 1–3   → núcleo funcional inicial  </w:t>
       </w:r>
     </w:p>
     <w:p>
       <w:pPr>
-        <w:pStyle w:val="Normal"/>
+        <w:pStyle w:val="Textopreformateado"/>
         <w:rPr>
           <w:rFonts w:ascii="Liberation Serif" w:hAnsi="Liberation Serif"/>
+          <w:b/>
+          <w:b/>
+          <w:bCs/>
+          <w:sz w:val="36"/>
+          <w:szCs w:val="36"/>
           <w:lang w:val="es-ES"/>
         </w:rPr>
       </w:pPr>
       <w:r>
-        <w:rPr>
-          <w:rFonts w:ascii="Liberation Serif" w:hAnsi="Liberation Serif"/>
-          <w:lang w:val="es-ES"/>
-        </w:rPr>
-        <w:t>Inversión solicitada: 15.000 – 30.000 €</w:t>
+        <w:rPr/>
+        <w:t xml:space="preserve">Mes 4–6   → MVP estable  </w:t>
       </w:r>
     </w:p>
     <w:p>
       <w:pPr>
-        <w:pStyle w:val="Normal"/>
+        <w:pStyle w:val="Textopreformateado"/>
         <w:rPr>
           <w:rFonts w:ascii="Liberation Serif" w:hAnsi="Liberation Serif"/>
+          <w:b/>
+          <w:b/>
+          <w:bCs/>
+          <w:sz w:val="36"/>
+          <w:szCs w:val="36"/>
           <w:lang w:val="es-ES"/>
         </w:rPr>
       </w:pPr>
       <w:r>
-        <w:rPr>
-          <w:rFonts w:ascii="Liberation Serif" w:hAnsi="Liberation Serif"/>
-          <w:lang w:val="es-ES"/>
-        </w:rPr>
-        <w:t>Instrumento: Participación en la futura sociedad.</w:t>
+        <w:rPr/>
+        <w:t xml:space="preserve">Mes 6–9   → validación técnica  </w:t>
       </w:r>
     </w:p>
     <w:p>
       <w:pPr>
-        <w:pStyle w:val="Normal"/>
+        <w:pStyle w:val="Textopreformateado"/>
         <w:rPr>
           <w:rFonts w:ascii="Liberation Serif" w:hAnsi="Liberation Serif"/>
+          <w:b/>
+          <w:b/>
+          <w:bCs/>
+          <w:sz w:val="36"/>
+          <w:szCs w:val="36"/>
           <w:lang w:val="es-ES"/>
         </w:rPr>
       </w:pPr>
       <w:r>
-        <w:rPr>
-          <w:rFonts w:ascii="Liberation Serif" w:hAnsi="Liberation Serif"/>
-          <w:lang w:val="es-ES"/>
-        </w:rPr>
-        <w:t>Naturaleza: Inversión en fase inicial destinada a activación operativa y desarrollo del producto</w:t>
+        <w:rPr/>
+        <w:t xml:space="preserve">Mes 9–12  → solicitud y acceso a ENISA  </w:t>
       </w:r>
     </w:p>
     <w:p>
       <w:pPr>
-        <w:pStyle w:val="Normal"/>
+        <w:sectPr>
+          <w:type w:val="continuous"/>
+          <w:pgSz w:w="12240" w:h="15840"/>
+          <w:pgMar w:left="1800" w:right="1800" w:gutter="0" w:header="0" w:top="1440" w:footer="0" w:bottom="1440"/>
+          <w:formProt w:val="false"/>
+          <w:textDirection w:val="lrTb"/>
+          <w:docGrid w:type="default" w:linePitch="360" w:charSpace="4096"/>
+        </w:sectPr>
+      </w:pPr>
+    </w:p>
+    <w:p>
+      <w:pPr>
+        <w:pStyle w:val="Cuerpodetexto"/>
         <w:rPr>
           <w:rFonts w:ascii="Liberation Serif" w:hAnsi="Liberation Serif"/>
+          <w:b/>
+          <w:b/>
+          <w:bCs/>
+          <w:sz w:val="36"/>
+          <w:szCs w:val="36"/>
           <w:lang w:val="es-ES"/>
         </w:rPr>
       </w:pPr>
       <w:r>
-        <w:rPr>
-          <w:rFonts w:ascii="Liberation Serif" w:hAnsi="Liberation Serif"/>
-          <w:lang w:val="es-ES"/>
-        </w:rPr>
+        <w:rPr/>
+        <w:t>El objetivo no es volumen de features.</w:t>
+        <w:br/>
+        <w:t>Es demostrar viabilidad estructural.</w:t>
       </w:r>
     </w:p>
     <w:p>
       <w:pPr>
-        <w:pStyle w:val="Normal"/>
+        <w:pStyle w:val="Lneahorizontal"/>
         <w:rPr>
           <w:rFonts w:ascii="Liberation Serif" w:hAnsi="Liberation Serif"/>
           <w:b/>
           <w:b/>
           <w:bCs/>
-          <w:sz w:val="28"/>
-          <w:szCs w:val="28"/>
+          <w:sz w:val="36"/>
+          <w:szCs w:val="36"/>
           <w:lang w:val="es-ES"/>
         </w:rPr>
       </w:pPr>
       <w:r>
-        <w:rPr>
-          <w:rFonts w:ascii="Liberation Serif" w:hAnsi="Liberation Serif"/>
-          <w:b/>
-          <w:bCs/>
-          <w:sz w:val="28"/>
-          <w:szCs w:val="28"/>
-          <w:lang w:val="es-ES"/>
-        </w:rPr>
-        <w:t>8. Conclusión</w:t>
+        <w:rPr/>
       </w:r>
     </w:p>
     <w:p>
       <w:pPr>
-        <w:pStyle w:val="Normal"/>
+        <w:pStyle w:val="Ttulo2"/>
+        <w:spacing w:before="200" w:after="283"/>
         <w:rPr>
           <w:rFonts w:ascii="Liberation Serif" w:hAnsi="Liberation Serif"/>
+          <w:b/>
+          <w:b/>
+          <w:bCs/>
+          <w:sz w:val="36"/>
+          <w:szCs w:val="36"/>
           <w:lang w:val="es-ES"/>
         </w:rPr>
       </w:pPr>
       <w:r>
         <w:rPr>
-          <w:rFonts w:ascii="Liberation Serif" w:hAnsi="Liberation Serif"/>
-          <w:lang w:val="es-ES"/>
+          <w:rStyle w:val="Destaquemayor"/>
+          <w:b/>
         </w:rPr>
+        <w:t>7. Propuesta al inversor</w:t>
       </w:r>
     </w:p>
     <w:p>
       <w:pPr>
-        <w:pStyle w:val="Normal"/>
+        <w:pStyle w:val="Cuerpodetexto"/>
         <w:rPr>
           <w:rFonts w:ascii="Liberation Serif" w:hAnsi="Liberation Serif"/>
+          <w:b/>
+          <w:b/>
+          <w:bCs/>
+          <w:sz w:val="36"/>
+          <w:szCs w:val="36"/>
           <w:lang w:val="es-ES"/>
         </w:rPr>
       </w:pPr>
       <w:r>
         <w:rPr>
-          <w:rFonts w:ascii="Liberation Serif" w:hAnsi="Liberation Serif"/>
-          <w:lang w:val="es-ES"/>
+          <w:rStyle w:val="Destaquemayor"/>
         </w:rPr>
-        <w:t>La inversión propuesta permite transformar un proyecto definido a nivel técnico en un proyecto operativo con capacidad de evolución.</w:t>
+        <w:t>Ticket:</w:t>
+      </w:r>
+      <w:r>
+        <w:rPr/>
+        <w:t xml:space="preserve"> 30.000 – 60.000 €</w:t>
+        <w:br/>
+      </w:r>
+      <w:r>
+        <w:rPr>
+          <w:rStyle w:val="Destaquemayor"/>
+        </w:rPr>
+        <w:t>Instrumento:</w:t>
+      </w:r>
+      <w:r>
+        <w:rPr/>
+        <w:t xml:space="preserve"> participación en futura sociedad</w:t>
       </w:r>
     </w:p>
     <w:p>
       <w:pPr>
-        <w:pStyle w:val="Normal"/>
+        <w:pStyle w:val="Cuerpodetexto"/>
         <w:rPr>
           <w:rFonts w:ascii="Liberation Serif" w:hAnsi="Liberation Serif"/>
+          <w:b/>
+          <w:b/>
+          <w:bCs/>
+          <w:sz w:val="36"/>
+          <w:szCs w:val="36"/>
           <w:lang w:val="es-ES"/>
         </w:rPr>
       </w:pPr>
       <w:r>
         <w:rPr>
-          <w:rFonts w:ascii="Liberation Serif" w:hAnsi="Liberation Serif"/>
-          <w:lang w:val="es-ES"/>
+          <w:rStyle w:val="Destaquemayor"/>
         </w:rPr>
+        <w:t>Rol del capital</w:t>
       </w:r>
     </w:p>
     <w:p>
       <w:pPr>
-        <w:pStyle w:val="Normal"/>
+        <w:pStyle w:val="Cuerpodetexto"/>
+        <w:numPr>
+          <w:ilvl w:val="0"/>
+          <w:numId w:val="16"/>
+        </w:numPr>
+        <w:tabs>
+          <w:tab w:val="clear" w:pos="720"/>
+          <w:tab w:val="left" w:pos="0" w:leader="none"/>
+        </w:tabs>
+        <w:spacing w:before="0" w:after="0"/>
+        <w:ind w:left="709" w:hanging="283"/>
         <w:rPr>
           <w:rFonts w:ascii="Liberation Serif" w:hAnsi="Liberation Serif"/>
+          <w:b/>
+          <w:b/>
+          <w:bCs/>
+          <w:sz w:val="36"/>
+          <w:szCs w:val="36"/>
           <w:lang w:val="es-ES"/>
         </w:rPr>
       </w:pPr>
       <w:r>
-        <w:rPr>
-          <w:rFonts w:ascii="Liberation Serif" w:hAnsi="Liberation Serif"/>
-          <w:lang w:val="es-ES"/>
-        </w:rPr>
-        <w:t>El enfoque se basa en:</w:t>
+        <w:rPr/>
+        <w:t xml:space="preserve">habilitar ejecución continua </w:t>
       </w:r>
     </w:p>
     <w:p>
       <w:pPr>
-        <w:pStyle w:val="Normal"/>
+        <w:pStyle w:val="Cuerpodetexto"/>
+        <w:numPr>
+          <w:ilvl w:val="0"/>
+          <w:numId w:val="16"/>
+        </w:numPr>
+        <w:tabs>
+          <w:tab w:val="clear" w:pos="720"/>
+          <w:tab w:val="left" w:pos="0" w:leader="none"/>
+        </w:tabs>
+        <w:spacing w:before="0" w:after="0"/>
+        <w:ind w:left="709" w:hanging="283"/>
         <w:rPr>
           <w:rFonts w:ascii="Liberation Serif" w:hAnsi="Liberation Serif"/>
+          <w:b/>
+          <w:b/>
+          <w:bCs/>
+          <w:sz w:val="36"/>
+          <w:szCs w:val="36"/>
           <w:lang w:val="es-ES"/>
         </w:rPr>
       </w:pPr>
       <w:r>
-        <w:rPr>
-          <w:rFonts w:ascii="Liberation Serif" w:hAnsi="Liberation Serif"/>
-          <w:lang w:val="es-ES"/>
-        </w:rPr>
-        <w:t>- Bajo capital inicial</w:t>
+        <w:rPr/>
+        <w:t xml:space="preserve">reducir riesgo de discontinuidad </w:t>
       </w:r>
     </w:p>
     <w:p>
       <w:pPr>
-        <w:pStyle w:val="Normal"/>
+        <w:pStyle w:val="Cuerpodetexto"/>
+        <w:numPr>
+          <w:ilvl w:val="0"/>
+          <w:numId w:val="16"/>
+        </w:numPr>
+        <w:tabs>
+          <w:tab w:val="clear" w:pos="720"/>
+          <w:tab w:val="left" w:pos="0" w:leader="none"/>
+        </w:tabs>
+        <w:ind w:left="709" w:hanging="283"/>
         <w:rPr>
           <w:rFonts w:ascii="Liberation Serif" w:hAnsi="Liberation Serif"/>
+          <w:b/>
+          <w:b/>
+          <w:bCs/>
+          <w:sz w:val="36"/>
+          <w:szCs w:val="36"/>
           <w:lang w:val="es-ES"/>
         </w:rPr>
       </w:pPr>
       <w:r>
-        <w:rPr>
-          <w:rFonts w:ascii="Liberation Serif" w:hAnsi="Liberation Serif"/>
-          <w:lang w:val="es-ES"/>
-        </w:rPr>
-        <w:t>- Desarrollo progresivo</w:t>
+        <w:rPr/>
+        <w:t xml:space="preserve">posicionar el proyecto para financiación institucional </w:t>
       </w:r>
     </w:p>
     <w:p>
       <w:pPr>
-        <w:pStyle w:val="Normal"/>
+        <w:pStyle w:val="Lneahorizontal"/>
         <w:rPr>
           <w:rFonts w:ascii="Liberation Serif" w:hAnsi="Liberation Serif"/>
+          <w:b/>
+          <w:b/>
+          <w:bCs/>
+          <w:sz w:val="36"/>
+          <w:szCs w:val="36"/>
           <w:lang w:val="es-ES"/>
         </w:rPr>
       </w:pPr>
       <w:r>
-        <w:rPr>
-          <w:rFonts w:ascii="Liberation Serif" w:hAnsi="Liberation Serif"/>
-          <w:lang w:val="es-ES"/>
-        </w:rPr>
-        <w:t>- Incremento de valor por iteración</w:t>
+        <w:rPr/>
       </w:r>
     </w:p>
     <w:p>
       <w:pPr>
-        <w:pStyle w:val="Normal"/>
+        <w:pStyle w:val="Ttulo2"/>
+        <w:spacing w:before="200" w:after="283"/>
         <w:rPr>
           <w:rFonts w:ascii="Liberation Serif" w:hAnsi="Liberation Serif"/>
+          <w:b/>
+          <w:b/>
+          <w:bCs/>
+          <w:sz w:val="36"/>
+          <w:szCs w:val="36"/>
           <w:lang w:val="es-ES"/>
         </w:rPr>
       </w:pPr>
       <w:r>
         <w:rPr>
-          <w:rFonts w:ascii="Liberation Serif" w:hAnsi="Liberation Serif"/>
-          <w:lang w:val="es-ES"/>
+          <w:rStyle w:val="Destaquemayor"/>
+          <w:b/>
         </w:rPr>
+        <w:t>8. Lectura correcta de la oportunidad</w:t>
       </w:r>
     </w:p>
     <w:p>
       <w:pPr>
-        <w:pStyle w:val="Normal"/>
+        <w:pStyle w:val="Cuerpodetexto"/>
         <w:rPr>
           <w:rFonts w:ascii="Liberation Serif" w:hAnsi="Liberation Serif"/>
+          <w:b/>
+          <w:b/>
+          <w:bCs/>
+          <w:sz w:val="36"/>
+          <w:szCs w:val="36"/>
           <w:lang w:val="es-ES"/>
         </w:rPr>
       </w:pPr>
       <w:r>
-        <w:rPr>
-          <w:rFonts w:ascii="Liberation Serif" w:hAnsi="Liberation Serif"/>
-          <w:lang w:val="es-ES"/>
-        </w:rPr>
-        <w:t>Esta estructura permite avanzar hacia fases de financiación superiores sin necesidad de una inversión inicial elevada.</w:t>
+        <w:rPr/>
+        <w:t>Esta inversión no busca retorno inmediato.</w:t>
       </w:r>
     </w:p>
     <w:p>
       <w:pPr>
-        <w:pStyle w:val="Normal"/>
-        <w:widowControl/>
-        <w:bidi w:val="0"/>
-        <w:spacing w:lineRule="auto" w:line="276" w:before="0" w:after="200"/>
-        <w:jc w:val="left"/>
+        <w:pStyle w:val="Cuerpodetexto"/>
         <w:rPr>
           <w:rFonts w:ascii="Liberation Serif" w:hAnsi="Liberation Serif"/>
+          <w:b/>
+          <w:b/>
+          <w:bCs/>
+          <w:sz w:val="36"/>
+          <w:szCs w:val="36"/>
           <w:lang w:val="es-ES"/>
         </w:rPr>
       </w:pPr>
       <w:r>
+        <w:rPr/>
+        <w:t>Busca participar en el momento donde:</w:t>
+      </w:r>
+    </w:p>
+    <w:p>
+      <w:pPr>
+        <w:pStyle w:val="Cuerpodetexto"/>
+        <w:numPr>
+          <w:ilvl w:val="0"/>
+          <w:numId w:val="17"/>
+        </w:numPr>
+        <w:tabs>
+          <w:tab w:val="clear" w:pos="720"/>
+          <w:tab w:val="left" w:pos="0" w:leader="none"/>
+        </w:tabs>
+        <w:spacing w:before="0" w:after="0"/>
+        <w:ind w:left="709" w:hanging="283"/>
         <w:rPr>
           <w:rFonts w:ascii="Liberation Serif" w:hAnsi="Liberation Serif"/>
+          <w:b/>
+          <w:b/>
+          <w:bCs/>
+          <w:sz w:val="36"/>
+          <w:szCs w:val="36"/>
           <w:lang w:val="es-ES"/>
         </w:rPr>
+      </w:pPr>
+      <w:r>
+        <w:rPr/>
+        <w:t xml:space="preserve">el riesgo conceptual ya está reducido </w:t>
+      </w:r>
+    </w:p>
+    <w:p>
+      <w:pPr>
+        <w:pStyle w:val="Cuerpodetexto"/>
+        <w:numPr>
+          <w:ilvl w:val="0"/>
+          <w:numId w:val="17"/>
+        </w:numPr>
+        <w:tabs>
+          <w:tab w:val="clear" w:pos="720"/>
+          <w:tab w:val="left" w:pos="0" w:leader="none"/>
+        </w:tabs>
+        <w:ind w:left="709" w:hanging="283"/>
+        <w:rPr>
+          <w:rFonts w:ascii="Liberation Serif" w:hAnsi="Liberation Serif"/>
+          <w:b/>
+          <w:b/>
+          <w:bCs/>
+          <w:sz w:val="36"/>
+          <w:szCs w:val="36"/>
+          <w:lang w:val="es-ES"/>
+        </w:rPr>
+      </w:pPr>
+      <w:r>
+        <w:rPr/>
+        <w:t xml:space="preserve">pero el activo aún no está construido </w:t>
+      </w:r>
+    </w:p>
+    <w:p>
+      <w:pPr>
+        <w:pStyle w:val="Cuerpodetexto"/>
+        <w:rPr>
+          <w:rFonts w:ascii="Liberation Serif" w:hAnsi="Liberation Serif"/>
+          <w:b/>
+          <w:b/>
+          <w:bCs/>
+          <w:sz w:val="36"/>
+          <w:szCs w:val="36"/>
+          <w:lang w:val="es-ES"/>
+        </w:rPr>
+      </w:pPr>
+      <w:r>
+        <w:rPr/>
+        <w:t>Es el punto donde el capital:</w:t>
+      </w:r>
+    </w:p>
+    <w:p>
+      <w:pPr>
+        <w:pStyle w:val="Cuerpodetexto"/>
+        <w:numPr>
+          <w:ilvl w:val="0"/>
+          <w:numId w:val="18"/>
+        </w:numPr>
+        <w:tabs>
+          <w:tab w:val="clear" w:pos="720"/>
+          <w:tab w:val="left" w:pos="0" w:leader="none"/>
+        </w:tabs>
+        <w:spacing w:before="0" w:after="0"/>
+        <w:ind w:left="709" w:hanging="283"/>
+        <w:rPr>
+          <w:rFonts w:ascii="Liberation Serif" w:hAnsi="Liberation Serif"/>
+          <w:b/>
+          <w:b/>
+          <w:bCs/>
+          <w:sz w:val="36"/>
+          <w:szCs w:val="36"/>
+          <w:lang w:val="es-ES"/>
+        </w:rPr>
+      </w:pPr>
+      <w:r>
+        <w:rPr/>
+        <w:t xml:space="preserve">no financia marketing </w:t>
+      </w:r>
+    </w:p>
+    <w:p>
+      <w:pPr>
+        <w:pStyle w:val="Cuerpodetexto"/>
+        <w:numPr>
+          <w:ilvl w:val="0"/>
+          <w:numId w:val="18"/>
+        </w:numPr>
+        <w:tabs>
+          <w:tab w:val="clear" w:pos="720"/>
+          <w:tab w:val="left" w:pos="0" w:leader="none"/>
+        </w:tabs>
+        <w:spacing w:before="0" w:after="0"/>
+        <w:ind w:left="709" w:hanging="283"/>
+        <w:rPr>
+          <w:rFonts w:ascii="Liberation Serif" w:hAnsi="Liberation Serif"/>
+          <w:b/>
+          <w:b/>
+          <w:bCs/>
+          <w:sz w:val="36"/>
+          <w:szCs w:val="36"/>
+          <w:lang w:val="es-ES"/>
+        </w:rPr>
+      </w:pPr>
+      <w:r>
+        <w:rPr/>
+        <w:t xml:space="preserve">no financia escala </w:t>
+      </w:r>
+    </w:p>
+    <w:p>
+      <w:pPr>
+        <w:pStyle w:val="Cuerpodetexto"/>
+        <w:numPr>
+          <w:ilvl w:val="0"/>
+          <w:numId w:val="18"/>
+        </w:numPr>
+        <w:tabs>
+          <w:tab w:val="clear" w:pos="720"/>
+          <w:tab w:val="left" w:pos="0" w:leader="none"/>
+        </w:tabs>
+        <w:ind w:left="709" w:hanging="283"/>
+        <w:rPr>
+          <w:rFonts w:ascii="Liberation Serif" w:hAnsi="Liberation Serif"/>
+          <w:b/>
+          <w:b/>
+          <w:bCs/>
+          <w:sz w:val="36"/>
+          <w:szCs w:val="36"/>
+          <w:lang w:val="es-ES"/>
+        </w:rPr>
+      </w:pPr>
+      <w:r>
+        <w:rPr/>
+        <w:t xml:space="preserve">financia </w:t>
+      </w:r>
+      <w:r>
+        <w:rPr>
+          <w:rStyle w:val="Destaquemayor"/>
+        </w:rPr>
+        <w:t>la validación de la arquitectura</w:t>
+      </w:r>
+      <w:r>
+        <w:rPr/>
+        <w:t xml:space="preserve"> </w:t>
+      </w:r>
+    </w:p>
+    <w:p>
+      <w:pPr>
+        <w:pStyle w:val="Lneahorizontal"/>
+        <w:rPr>
+          <w:rFonts w:ascii="Liberation Serif" w:hAnsi="Liberation Serif"/>
+          <w:b/>
+          <w:b/>
+          <w:bCs/>
+          <w:sz w:val="36"/>
+          <w:szCs w:val="36"/>
+          <w:lang w:val="es-ES"/>
+        </w:rPr>
+      </w:pPr>
+      <w:r>
+        <w:rPr/>
+      </w:r>
+    </w:p>
+    <w:p>
+      <w:pPr>
+        <w:pStyle w:val="Ttulo2"/>
+        <w:spacing w:before="200" w:after="283"/>
+        <w:rPr>
+          <w:rFonts w:ascii="Liberation Serif" w:hAnsi="Liberation Serif"/>
+          <w:b/>
+          <w:b/>
+          <w:bCs/>
+          <w:sz w:val="36"/>
+          <w:szCs w:val="36"/>
+          <w:lang w:val="es-ES"/>
+        </w:rPr>
+      </w:pPr>
+      <w:r>
+        <w:rPr>
+          <w:rStyle w:val="Destaquemayor"/>
+          <w:b/>
+        </w:rPr>
+        <w:t>9. Conclusión</w:t>
+      </w:r>
+    </w:p>
+    <w:p>
+      <w:pPr>
+        <w:pStyle w:val="Cuerpodetexto"/>
+        <w:rPr>
+          <w:rFonts w:ascii="Liberation Serif" w:hAnsi="Liberation Serif"/>
+          <w:b/>
+          <w:b/>
+          <w:bCs/>
+          <w:sz w:val="36"/>
+          <w:szCs w:val="36"/>
+          <w:lang w:val="es-ES"/>
+        </w:rPr>
+      </w:pPr>
+      <w:r>
+        <w:rPr/>
+        <w:t>ZeroCog no necesita una gran inversión inicial.</w:t>
+      </w:r>
+    </w:p>
+    <w:p>
+      <w:pPr>
+        <w:pStyle w:val="Cuerpodetexto"/>
+        <w:rPr>
+          <w:rFonts w:ascii="Liberation Serif" w:hAnsi="Liberation Serif"/>
+          <w:b/>
+          <w:b/>
+          <w:bCs/>
+          <w:sz w:val="36"/>
+          <w:szCs w:val="36"/>
+          <w:lang w:val="es-ES"/>
+        </w:rPr>
+      </w:pPr>
+      <w:r>
+        <w:rPr/>
+        <w:t>Necesita continuidad suficiente para completar la transición:</w:t>
+      </w:r>
+    </w:p>
+    <w:p>
+      <w:pPr>
+        <w:sectPr>
+          <w:type w:val="continuous"/>
+          <w:pgSz w:w="12240" w:h="15840"/>
+          <w:pgMar w:left="1800" w:right="1800" w:gutter="0" w:header="0" w:top="1440" w:footer="0" w:bottom="1440"/>
+          <w:pgNumType w:fmt="decimal"/>
+          <w:formProt w:val="false"/>
+          <w:textDirection w:val="lrTb"/>
+          <w:docGrid w:type="default" w:linePitch="360" w:charSpace="4096"/>
+        </w:sectPr>
+      </w:pPr>
+    </w:p>
+    <w:p>
+      <w:pPr>
+        <w:pStyle w:val="Textopreformateado"/>
+        <w:rPr>
+          <w:rFonts w:ascii="Liberation Serif" w:hAnsi="Liberation Serif"/>
+          <w:b/>
+          <w:b/>
+          <w:bCs/>
+          <w:sz w:val="36"/>
+          <w:szCs w:val="36"/>
+          <w:lang w:val="es-ES"/>
+        </w:rPr>
+      </w:pPr>
+      <w:bookmarkStart w:id="2" w:name="code-block-viewer_Copy_2"/>
+      <w:bookmarkEnd w:id="2"/>
+      <w:r>
+        <w:rPr/>
+        <w:t>arquitectura definida</w:t>
+      </w:r>
+    </w:p>
+    <w:p>
+      <w:pPr>
+        <w:pStyle w:val="Textopreformateado"/>
+        <w:rPr>
+          <w:rFonts w:ascii="Liberation Serif" w:hAnsi="Liberation Serif"/>
+          <w:b/>
+          <w:b/>
+          <w:bCs/>
+          <w:sz w:val="36"/>
+          <w:szCs w:val="36"/>
+          <w:lang w:val="es-ES"/>
+        </w:rPr>
+      </w:pPr>
+      <w:r>
+        <w:rPr/>
+        <w:t>→</w:t>
+      </w:r>
+    </w:p>
+    <w:p>
+      <w:pPr>
+        <w:pStyle w:val="Textopreformateado"/>
+        <w:rPr>
+          <w:rFonts w:ascii="Liberation Serif" w:hAnsi="Liberation Serif"/>
+          <w:b/>
+          <w:b/>
+          <w:bCs/>
+          <w:sz w:val="36"/>
+          <w:szCs w:val="36"/>
+          <w:lang w:val="es-ES"/>
+        </w:rPr>
+      </w:pPr>
+      <w:r>
+        <w:rPr/>
+        <w:t>sistema validado</w:t>
+      </w:r>
+    </w:p>
+    <w:p>
+      <w:pPr>
+        <w:pStyle w:val="Textopreformateado"/>
+        <w:rPr>
+          <w:rFonts w:ascii="Liberation Serif" w:hAnsi="Liberation Serif"/>
+          <w:b/>
+          <w:b/>
+          <w:bCs/>
+          <w:sz w:val="36"/>
+          <w:szCs w:val="36"/>
+          <w:lang w:val="es-ES"/>
+        </w:rPr>
+      </w:pPr>
+      <w:r>
+        <w:rPr/>
+        <w:t>→</w:t>
+      </w:r>
+    </w:p>
+    <w:p>
+      <w:pPr>
+        <w:pStyle w:val="Textopreformateado"/>
+        <w:rPr>
+          <w:rFonts w:ascii="Liberation Serif" w:hAnsi="Liberation Serif"/>
+          <w:b/>
+          <w:b/>
+          <w:bCs/>
+          <w:sz w:val="36"/>
+          <w:szCs w:val="36"/>
+          <w:lang w:val="es-ES"/>
+        </w:rPr>
+      </w:pPr>
+      <w:r>
+        <w:rPr/>
+        <w:t>financiación estructurada</w:t>
+      </w:r>
+    </w:p>
+    <w:p>
+      <w:pPr>
+        <w:sectPr>
+          <w:type w:val="continuous"/>
+          <w:pgSz w:w="12240" w:h="15840"/>
+          <w:pgMar w:left="1800" w:right="1800" w:gutter="0" w:header="0" w:top="1440" w:footer="0" w:bottom="1440"/>
+          <w:formProt w:val="false"/>
+          <w:textDirection w:val="lrTb"/>
+          <w:docGrid w:type="default" w:linePitch="360" w:charSpace="4096"/>
+        </w:sectPr>
+      </w:pPr>
+    </w:p>
+    <w:p>
+      <w:pPr>
+        <w:pStyle w:val="Cuerpodetexto"/>
+        <w:rPr>
+          <w:rFonts w:ascii="Liberation Serif" w:hAnsi="Liberation Serif"/>
+          <w:b/>
+          <w:b/>
+          <w:bCs/>
+          <w:sz w:val="36"/>
+          <w:szCs w:val="36"/>
+          <w:lang w:val="es-ES"/>
+        </w:rPr>
+      </w:pPr>
+      <w:r>
+        <w:rPr/>
+        <w:t>Esta ronda existe para cubrir exactamente ese tramo.</w:t>
+      </w:r>
+    </w:p>
+    <w:p>
+      <w:pPr>
+        <w:pStyle w:val="Normal"/>
+        <w:spacing w:before="0" w:after="200"/>
+        <w:rPr>
+          <w:rFonts w:ascii="Liberation Serif" w:hAnsi="Liberation Serif"/>
+          <w:b/>
+          <w:b/>
+          <w:bCs/>
+          <w:sz w:val="36"/>
+          <w:szCs w:val="36"/>
+          <w:lang w:val="es-ES"/>
+        </w:rPr>
+      </w:pPr>
+      <w:r>
+        <w:rPr/>
       </w:r>
     </w:p>
     <w:sectPr>
-      <w:type w:val="nextPage"/>
+      <w:type w:val="continuous"/>
       <w:pgSz w:w="12240" w:h="15840"/>
       <w:pgMar w:left="1800" w:right="1800" w:gutter="0" w:header="0" w:top="1440" w:footer="0" w:bottom="1440"/>
       <w:pgNumType w:fmt="decimal"/>
@@ -2090,6 +3200,1650 @@
     </w:lvl>
   </w:abstractNum>
   <w:abstractNum w:abstractNumId="7">
+    <w:lvl w:ilvl="0">
+      <w:start w:val="1"/>
+      <w:numFmt w:val="bullet"/>
+      <w:lvlText w:val=""/>
+      <w:lvlJc w:val="left"/>
+      <w:pPr>
+        <w:tabs>
+          <w:tab w:val="num" w:pos="709"/>
+        </w:tabs>
+        <w:ind w:left="709" w:hanging="283"/>
+      </w:pPr>
+      <w:rPr>
+        <w:rFonts w:ascii="Symbol" w:hAnsi="Symbol" w:cs="Symbol" w:hint="default"/>
+      </w:rPr>
+    </w:lvl>
+    <w:lvl w:ilvl="1">
+      <w:start w:val="1"/>
+      <w:numFmt w:val="bullet"/>
+      <w:lvlText w:val=""/>
+      <w:lvlJc w:val="left"/>
+      <w:pPr>
+        <w:tabs>
+          <w:tab w:val="num" w:pos="1418"/>
+        </w:tabs>
+        <w:ind w:left="1418" w:hanging="283"/>
+      </w:pPr>
+      <w:rPr>
+        <w:rFonts w:ascii="Symbol" w:hAnsi="Symbol" w:cs="Symbol" w:hint="default"/>
+      </w:rPr>
+    </w:lvl>
+    <w:lvl w:ilvl="2">
+      <w:start w:val="1"/>
+      <w:numFmt w:val="bullet"/>
+      <w:lvlText w:val=""/>
+      <w:lvlJc w:val="left"/>
+      <w:pPr>
+        <w:tabs>
+          <w:tab w:val="num" w:pos="2127"/>
+        </w:tabs>
+        <w:ind w:left="2127" w:hanging="283"/>
+      </w:pPr>
+      <w:rPr>
+        <w:rFonts w:ascii="Symbol" w:hAnsi="Symbol" w:cs="Symbol" w:hint="default"/>
+      </w:rPr>
+    </w:lvl>
+    <w:lvl w:ilvl="3">
+      <w:start w:val="1"/>
+      <w:numFmt w:val="bullet"/>
+      <w:lvlText w:val=""/>
+      <w:lvlJc w:val="left"/>
+      <w:pPr>
+        <w:tabs>
+          <w:tab w:val="num" w:pos="2836"/>
+        </w:tabs>
+        <w:ind w:left="2836" w:hanging="283"/>
+      </w:pPr>
+      <w:rPr>
+        <w:rFonts w:ascii="Symbol" w:hAnsi="Symbol" w:cs="Symbol" w:hint="default"/>
+      </w:rPr>
+    </w:lvl>
+    <w:lvl w:ilvl="4">
+      <w:start w:val="1"/>
+      <w:numFmt w:val="bullet"/>
+      <w:lvlText w:val=""/>
+      <w:lvlJc w:val="left"/>
+      <w:pPr>
+        <w:tabs>
+          <w:tab w:val="num" w:pos="3545"/>
+        </w:tabs>
+        <w:ind w:left="3545" w:hanging="283"/>
+      </w:pPr>
+      <w:rPr>
+        <w:rFonts w:ascii="Symbol" w:hAnsi="Symbol" w:cs="Symbol" w:hint="default"/>
+      </w:rPr>
+    </w:lvl>
+    <w:lvl w:ilvl="5">
+      <w:start w:val="1"/>
+      <w:numFmt w:val="bullet"/>
+      <w:lvlText w:val=""/>
+      <w:lvlJc w:val="left"/>
+      <w:pPr>
+        <w:tabs>
+          <w:tab w:val="num" w:pos="4254"/>
+        </w:tabs>
+        <w:ind w:left="4254" w:hanging="283"/>
+      </w:pPr>
+      <w:rPr>
+        <w:rFonts w:ascii="Symbol" w:hAnsi="Symbol" w:cs="Symbol" w:hint="default"/>
+      </w:rPr>
+    </w:lvl>
+    <w:lvl w:ilvl="6">
+      <w:start w:val="1"/>
+      <w:numFmt w:val="bullet"/>
+      <w:lvlText w:val=""/>
+      <w:lvlJc w:val="left"/>
+      <w:pPr>
+        <w:tabs>
+          <w:tab w:val="num" w:pos="4963"/>
+        </w:tabs>
+        <w:ind w:left="4963" w:hanging="283"/>
+      </w:pPr>
+      <w:rPr>
+        <w:rFonts w:ascii="Symbol" w:hAnsi="Symbol" w:cs="Symbol" w:hint="default"/>
+      </w:rPr>
+    </w:lvl>
+    <w:lvl w:ilvl="7">
+      <w:start w:val="1"/>
+      <w:numFmt w:val="bullet"/>
+      <w:lvlText w:val=""/>
+      <w:lvlJc w:val="left"/>
+      <w:pPr>
+        <w:tabs>
+          <w:tab w:val="num" w:pos="5672"/>
+        </w:tabs>
+        <w:ind w:left="5672" w:hanging="283"/>
+      </w:pPr>
+      <w:rPr>
+        <w:rFonts w:ascii="Symbol" w:hAnsi="Symbol" w:cs="Symbol" w:hint="default"/>
+      </w:rPr>
+    </w:lvl>
+    <w:lvl w:ilvl="8">
+      <w:start w:val="1"/>
+      <w:numFmt w:val="bullet"/>
+      <w:lvlText w:val=""/>
+      <w:lvlJc w:val="left"/>
+      <w:pPr>
+        <w:tabs>
+          <w:tab w:val="num" w:pos="6381"/>
+        </w:tabs>
+        <w:ind w:left="6381" w:hanging="283"/>
+      </w:pPr>
+      <w:rPr>
+        <w:rFonts w:ascii="Symbol" w:hAnsi="Symbol" w:cs="Symbol" w:hint="default"/>
+      </w:rPr>
+    </w:lvl>
+  </w:abstractNum>
+  <w:abstractNum w:abstractNumId="8">
+    <w:lvl w:ilvl="0">
+      <w:start w:val="1"/>
+      <w:numFmt w:val="bullet"/>
+      <w:lvlText w:val=""/>
+      <w:lvlJc w:val="left"/>
+      <w:pPr>
+        <w:tabs>
+          <w:tab w:val="num" w:pos="709"/>
+        </w:tabs>
+        <w:ind w:left="709" w:hanging="283"/>
+      </w:pPr>
+      <w:rPr>
+        <w:rFonts w:ascii="Symbol" w:hAnsi="Symbol" w:cs="Symbol" w:hint="default"/>
+      </w:rPr>
+    </w:lvl>
+    <w:lvl w:ilvl="1">
+      <w:start w:val="1"/>
+      <w:numFmt w:val="bullet"/>
+      <w:lvlText w:val=""/>
+      <w:lvlJc w:val="left"/>
+      <w:pPr>
+        <w:tabs>
+          <w:tab w:val="num" w:pos="1418"/>
+        </w:tabs>
+        <w:ind w:left="1418" w:hanging="283"/>
+      </w:pPr>
+      <w:rPr>
+        <w:rFonts w:ascii="Symbol" w:hAnsi="Symbol" w:cs="Symbol" w:hint="default"/>
+      </w:rPr>
+    </w:lvl>
+    <w:lvl w:ilvl="2">
+      <w:start w:val="1"/>
+      <w:numFmt w:val="bullet"/>
+      <w:lvlText w:val=""/>
+      <w:lvlJc w:val="left"/>
+      <w:pPr>
+        <w:tabs>
+          <w:tab w:val="num" w:pos="2127"/>
+        </w:tabs>
+        <w:ind w:left="2127" w:hanging="283"/>
+      </w:pPr>
+      <w:rPr>
+        <w:rFonts w:ascii="Symbol" w:hAnsi="Symbol" w:cs="Symbol" w:hint="default"/>
+      </w:rPr>
+    </w:lvl>
+    <w:lvl w:ilvl="3">
+      <w:start w:val="1"/>
+      <w:numFmt w:val="bullet"/>
+      <w:lvlText w:val=""/>
+      <w:lvlJc w:val="left"/>
+      <w:pPr>
+        <w:tabs>
+          <w:tab w:val="num" w:pos="2836"/>
+        </w:tabs>
+        <w:ind w:left="2836" w:hanging="283"/>
+      </w:pPr>
+      <w:rPr>
+        <w:rFonts w:ascii="Symbol" w:hAnsi="Symbol" w:cs="Symbol" w:hint="default"/>
+      </w:rPr>
+    </w:lvl>
+    <w:lvl w:ilvl="4">
+      <w:start w:val="1"/>
+      <w:numFmt w:val="bullet"/>
+      <w:lvlText w:val=""/>
+      <w:lvlJc w:val="left"/>
+      <w:pPr>
+        <w:tabs>
+          <w:tab w:val="num" w:pos="3545"/>
+        </w:tabs>
+        <w:ind w:left="3545" w:hanging="283"/>
+      </w:pPr>
+      <w:rPr>
+        <w:rFonts w:ascii="Symbol" w:hAnsi="Symbol" w:cs="Symbol" w:hint="default"/>
+      </w:rPr>
+    </w:lvl>
+    <w:lvl w:ilvl="5">
+      <w:start w:val="1"/>
+      <w:numFmt w:val="bullet"/>
+      <w:lvlText w:val=""/>
+      <w:lvlJc w:val="left"/>
+      <w:pPr>
+        <w:tabs>
+          <w:tab w:val="num" w:pos="4254"/>
+        </w:tabs>
+        <w:ind w:left="4254" w:hanging="283"/>
+      </w:pPr>
+      <w:rPr>
+        <w:rFonts w:ascii="Symbol" w:hAnsi="Symbol" w:cs="Symbol" w:hint="default"/>
+      </w:rPr>
+    </w:lvl>
+    <w:lvl w:ilvl="6">
+      <w:start w:val="1"/>
+      <w:numFmt w:val="bullet"/>
+      <w:lvlText w:val=""/>
+      <w:lvlJc w:val="left"/>
+      <w:pPr>
+        <w:tabs>
+          <w:tab w:val="num" w:pos="4963"/>
+        </w:tabs>
+        <w:ind w:left="4963" w:hanging="283"/>
+      </w:pPr>
+      <w:rPr>
+        <w:rFonts w:ascii="Symbol" w:hAnsi="Symbol" w:cs="Symbol" w:hint="default"/>
+      </w:rPr>
+    </w:lvl>
+    <w:lvl w:ilvl="7">
+      <w:start w:val="1"/>
+      <w:numFmt w:val="bullet"/>
+      <w:lvlText w:val=""/>
+      <w:lvlJc w:val="left"/>
+      <w:pPr>
+        <w:tabs>
+          <w:tab w:val="num" w:pos="5672"/>
+        </w:tabs>
+        <w:ind w:left="5672" w:hanging="283"/>
+      </w:pPr>
+      <w:rPr>
+        <w:rFonts w:ascii="Symbol" w:hAnsi="Symbol" w:cs="Symbol" w:hint="default"/>
+      </w:rPr>
+    </w:lvl>
+    <w:lvl w:ilvl="8">
+      <w:start w:val="1"/>
+      <w:numFmt w:val="bullet"/>
+      <w:lvlText w:val=""/>
+      <w:lvlJc w:val="left"/>
+      <w:pPr>
+        <w:tabs>
+          <w:tab w:val="num" w:pos="6381"/>
+        </w:tabs>
+        <w:ind w:left="6381" w:hanging="283"/>
+      </w:pPr>
+      <w:rPr>
+        <w:rFonts w:ascii="Symbol" w:hAnsi="Symbol" w:cs="Symbol" w:hint="default"/>
+      </w:rPr>
+    </w:lvl>
+  </w:abstractNum>
+  <w:abstractNum w:abstractNumId="9">
+    <w:lvl w:ilvl="0">
+      <w:start w:val="1"/>
+      <w:numFmt w:val="bullet"/>
+      <w:lvlText w:val=""/>
+      <w:lvlJc w:val="left"/>
+      <w:pPr>
+        <w:tabs>
+          <w:tab w:val="num" w:pos="709"/>
+        </w:tabs>
+        <w:ind w:left="709" w:hanging="283"/>
+      </w:pPr>
+      <w:rPr>
+        <w:rFonts w:ascii="Symbol" w:hAnsi="Symbol" w:cs="Symbol" w:hint="default"/>
+      </w:rPr>
+    </w:lvl>
+    <w:lvl w:ilvl="1">
+      <w:start w:val="1"/>
+      <w:numFmt w:val="bullet"/>
+      <w:lvlText w:val=""/>
+      <w:lvlJc w:val="left"/>
+      <w:pPr>
+        <w:tabs>
+          <w:tab w:val="num" w:pos="1418"/>
+        </w:tabs>
+        <w:ind w:left="1418" w:hanging="283"/>
+      </w:pPr>
+      <w:rPr>
+        <w:rFonts w:ascii="Symbol" w:hAnsi="Symbol" w:cs="Symbol" w:hint="default"/>
+      </w:rPr>
+    </w:lvl>
+    <w:lvl w:ilvl="2">
+      <w:start w:val="1"/>
+      <w:numFmt w:val="bullet"/>
+      <w:lvlText w:val=""/>
+      <w:lvlJc w:val="left"/>
+      <w:pPr>
+        <w:tabs>
+          <w:tab w:val="num" w:pos="2127"/>
+        </w:tabs>
+        <w:ind w:left="2127" w:hanging="283"/>
+      </w:pPr>
+      <w:rPr>
+        <w:rFonts w:ascii="Symbol" w:hAnsi="Symbol" w:cs="Symbol" w:hint="default"/>
+      </w:rPr>
+    </w:lvl>
+    <w:lvl w:ilvl="3">
+      <w:start w:val="1"/>
+      <w:numFmt w:val="bullet"/>
+      <w:lvlText w:val=""/>
+      <w:lvlJc w:val="left"/>
+      <w:pPr>
+        <w:tabs>
+          <w:tab w:val="num" w:pos="2836"/>
+        </w:tabs>
+        <w:ind w:left="2836" w:hanging="283"/>
+      </w:pPr>
+      <w:rPr>
+        <w:rFonts w:ascii="Symbol" w:hAnsi="Symbol" w:cs="Symbol" w:hint="default"/>
+      </w:rPr>
+    </w:lvl>
+    <w:lvl w:ilvl="4">
+      <w:start w:val="1"/>
+      <w:numFmt w:val="bullet"/>
+      <w:lvlText w:val=""/>
+      <w:lvlJc w:val="left"/>
+      <w:pPr>
+        <w:tabs>
+          <w:tab w:val="num" w:pos="3545"/>
+        </w:tabs>
+        <w:ind w:left="3545" w:hanging="283"/>
+      </w:pPr>
+      <w:rPr>
+        <w:rFonts w:ascii="Symbol" w:hAnsi="Symbol" w:cs="Symbol" w:hint="default"/>
+      </w:rPr>
+    </w:lvl>
+    <w:lvl w:ilvl="5">
+      <w:start w:val="1"/>
+      <w:numFmt w:val="bullet"/>
+      <w:lvlText w:val=""/>
+      <w:lvlJc w:val="left"/>
+      <w:pPr>
+        <w:tabs>
+          <w:tab w:val="num" w:pos="4254"/>
+        </w:tabs>
+        <w:ind w:left="4254" w:hanging="283"/>
+      </w:pPr>
+      <w:rPr>
+        <w:rFonts w:ascii="Symbol" w:hAnsi="Symbol" w:cs="Symbol" w:hint="default"/>
+      </w:rPr>
+    </w:lvl>
+    <w:lvl w:ilvl="6">
+      <w:start w:val="1"/>
+      <w:numFmt w:val="bullet"/>
+      <w:lvlText w:val=""/>
+      <w:lvlJc w:val="left"/>
+      <w:pPr>
+        <w:tabs>
+          <w:tab w:val="num" w:pos="4963"/>
+        </w:tabs>
+        <w:ind w:left="4963" w:hanging="283"/>
+      </w:pPr>
+      <w:rPr>
+        <w:rFonts w:ascii="Symbol" w:hAnsi="Symbol" w:cs="Symbol" w:hint="default"/>
+      </w:rPr>
+    </w:lvl>
+    <w:lvl w:ilvl="7">
+      <w:start w:val="1"/>
+      <w:numFmt w:val="bullet"/>
+      <w:lvlText w:val=""/>
+      <w:lvlJc w:val="left"/>
+      <w:pPr>
+        <w:tabs>
+          <w:tab w:val="num" w:pos="5672"/>
+        </w:tabs>
+        <w:ind w:left="5672" w:hanging="283"/>
+      </w:pPr>
+      <w:rPr>
+        <w:rFonts w:ascii="Symbol" w:hAnsi="Symbol" w:cs="Symbol" w:hint="default"/>
+      </w:rPr>
+    </w:lvl>
+    <w:lvl w:ilvl="8">
+      <w:start w:val="1"/>
+      <w:numFmt w:val="bullet"/>
+      <w:lvlText w:val=""/>
+      <w:lvlJc w:val="left"/>
+      <w:pPr>
+        <w:tabs>
+          <w:tab w:val="num" w:pos="6381"/>
+        </w:tabs>
+        <w:ind w:left="6381" w:hanging="283"/>
+      </w:pPr>
+      <w:rPr>
+        <w:rFonts w:ascii="Symbol" w:hAnsi="Symbol" w:cs="Symbol" w:hint="default"/>
+      </w:rPr>
+    </w:lvl>
+  </w:abstractNum>
+  <w:abstractNum w:abstractNumId="10">
+    <w:lvl w:ilvl="0">
+      <w:start w:val="1"/>
+      <w:numFmt w:val="bullet"/>
+      <w:lvlText w:val=""/>
+      <w:lvlJc w:val="left"/>
+      <w:pPr>
+        <w:tabs>
+          <w:tab w:val="num" w:pos="709"/>
+        </w:tabs>
+        <w:ind w:left="709" w:hanging="283"/>
+      </w:pPr>
+      <w:rPr>
+        <w:rFonts w:ascii="Symbol" w:hAnsi="Symbol" w:cs="Symbol" w:hint="default"/>
+      </w:rPr>
+    </w:lvl>
+    <w:lvl w:ilvl="1">
+      <w:start w:val="1"/>
+      <w:numFmt w:val="bullet"/>
+      <w:lvlText w:val=""/>
+      <w:lvlJc w:val="left"/>
+      <w:pPr>
+        <w:tabs>
+          <w:tab w:val="num" w:pos="1418"/>
+        </w:tabs>
+        <w:ind w:left="1418" w:hanging="283"/>
+      </w:pPr>
+      <w:rPr>
+        <w:rFonts w:ascii="Symbol" w:hAnsi="Symbol" w:cs="Symbol" w:hint="default"/>
+      </w:rPr>
+    </w:lvl>
+    <w:lvl w:ilvl="2">
+      <w:start w:val="1"/>
+      <w:numFmt w:val="bullet"/>
+      <w:lvlText w:val=""/>
+      <w:lvlJc w:val="left"/>
+      <w:pPr>
+        <w:tabs>
+          <w:tab w:val="num" w:pos="2127"/>
+        </w:tabs>
+        <w:ind w:left="2127" w:hanging="283"/>
+      </w:pPr>
+      <w:rPr>
+        <w:rFonts w:ascii="Symbol" w:hAnsi="Symbol" w:cs="Symbol" w:hint="default"/>
+      </w:rPr>
+    </w:lvl>
+    <w:lvl w:ilvl="3">
+      <w:start w:val="1"/>
+      <w:numFmt w:val="bullet"/>
+      <w:lvlText w:val=""/>
+      <w:lvlJc w:val="left"/>
+      <w:pPr>
+        <w:tabs>
+          <w:tab w:val="num" w:pos="2836"/>
+        </w:tabs>
+        <w:ind w:left="2836" w:hanging="283"/>
+      </w:pPr>
+      <w:rPr>
+        <w:rFonts w:ascii="Symbol" w:hAnsi="Symbol" w:cs="Symbol" w:hint="default"/>
+      </w:rPr>
+    </w:lvl>
+    <w:lvl w:ilvl="4">
+      <w:start w:val="1"/>
+      <w:numFmt w:val="bullet"/>
+      <w:lvlText w:val=""/>
+      <w:lvlJc w:val="left"/>
+      <w:pPr>
+        <w:tabs>
+          <w:tab w:val="num" w:pos="3545"/>
+        </w:tabs>
+        <w:ind w:left="3545" w:hanging="283"/>
+      </w:pPr>
+      <w:rPr>
+        <w:rFonts w:ascii="Symbol" w:hAnsi="Symbol" w:cs="Symbol" w:hint="default"/>
+      </w:rPr>
+    </w:lvl>
+    <w:lvl w:ilvl="5">
+      <w:start w:val="1"/>
+      <w:numFmt w:val="bullet"/>
+      <w:lvlText w:val=""/>
+      <w:lvlJc w:val="left"/>
+      <w:pPr>
+        <w:tabs>
+          <w:tab w:val="num" w:pos="4254"/>
+        </w:tabs>
+        <w:ind w:left="4254" w:hanging="283"/>
+      </w:pPr>
+      <w:rPr>
+        <w:rFonts w:ascii="Symbol" w:hAnsi="Symbol" w:cs="Symbol" w:hint="default"/>
+      </w:rPr>
+    </w:lvl>
+    <w:lvl w:ilvl="6">
+      <w:start w:val="1"/>
+      <w:numFmt w:val="bullet"/>
+      <w:lvlText w:val=""/>
+      <w:lvlJc w:val="left"/>
+      <w:pPr>
+        <w:tabs>
+          <w:tab w:val="num" w:pos="4963"/>
+        </w:tabs>
+        <w:ind w:left="4963" w:hanging="283"/>
+      </w:pPr>
+      <w:rPr>
+        <w:rFonts w:ascii="Symbol" w:hAnsi="Symbol" w:cs="Symbol" w:hint="default"/>
+      </w:rPr>
+    </w:lvl>
+    <w:lvl w:ilvl="7">
+      <w:start w:val="1"/>
+      <w:numFmt w:val="bullet"/>
+      <w:lvlText w:val=""/>
+      <w:lvlJc w:val="left"/>
+      <w:pPr>
+        <w:tabs>
+          <w:tab w:val="num" w:pos="5672"/>
+        </w:tabs>
+        <w:ind w:left="5672" w:hanging="283"/>
+      </w:pPr>
+      <w:rPr>
+        <w:rFonts w:ascii="Symbol" w:hAnsi="Symbol" w:cs="Symbol" w:hint="default"/>
+      </w:rPr>
+    </w:lvl>
+    <w:lvl w:ilvl="8">
+      <w:start w:val="1"/>
+      <w:numFmt w:val="bullet"/>
+      <w:lvlText w:val=""/>
+      <w:lvlJc w:val="left"/>
+      <w:pPr>
+        <w:tabs>
+          <w:tab w:val="num" w:pos="6381"/>
+        </w:tabs>
+        <w:ind w:left="6381" w:hanging="283"/>
+      </w:pPr>
+      <w:rPr>
+        <w:rFonts w:ascii="Symbol" w:hAnsi="Symbol" w:cs="Symbol" w:hint="default"/>
+      </w:rPr>
+    </w:lvl>
+  </w:abstractNum>
+  <w:abstractNum w:abstractNumId="11">
+    <w:lvl w:ilvl="0">
+      <w:start w:val="1"/>
+      <w:numFmt w:val="bullet"/>
+      <w:lvlText w:val=""/>
+      <w:lvlJc w:val="left"/>
+      <w:pPr>
+        <w:tabs>
+          <w:tab w:val="num" w:pos="709"/>
+        </w:tabs>
+        <w:ind w:left="709" w:hanging="283"/>
+      </w:pPr>
+      <w:rPr>
+        <w:rFonts w:ascii="Symbol" w:hAnsi="Symbol" w:cs="Symbol" w:hint="default"/>
+      </w:rPr>
+    </w:lvl>
+    <w:lvl w:ilvl="1">
+      <w:start w:val="1"/>
+      <w:numFmt w:val="bullet"/>
+      <w:lvlText w:val=""/>
+      <w:lvlJc w:val="left"/>
+      <w:pPr>
+        <w:tabs>
+          <w:tab w:val="num" w:pos="1418"/>
+        </w:tabs>
+        <w:ind w:left="1418" w:hanging="283"/>
+      </w:pPr>
+      <w:rPr>
+        <w:rFonts w:ascii="Symbol" w:hAnsi="Symbol" w:cs="Symbol" w:hint="default"/>
+      </w:rPr>
+    </w:lvl>
+    <w:lvl w:ilvl="2">
+      <w:start w:val="1"/>
+      <w:numFmt w:val="bullet"/>
+      <w:lvlText w:val=""/>
+      <w:lvlJc w:val="left"/>
+      <w:pPr>
+        <w:tabs>
+          <w:tab w:val="num" w:pos="2127"/>
+        </w:tabs>
+        <w:ind w:left="2127" w:hanging="283"/>
+      </w:pPr>
+      <w:rPr>
+        <w:rFonts w:ascii="Symbol" w:hAnsi="Symbol" w:cs="Symbol" w:hint="default"/>
+      </w:rPr>
+    </w:lvl>
+    <w:lvl w:ilvl="3">
+      <w:start w:val="1"/>
+      <w:numFmt w:val="bullet"/>
+      <w:lvlText w:val=""/>
+      <w:lvlJc w:val="left"/>
+      <w:pPr>
+        <w:tabs>
+          <w:tab w:val="num" w:pos="2836"/>
+        </w:tabs>
+        <w:ind w:left="2836" w:hanging="283"/>
+      </w:pPr>
+      <w:rPr>
+        <w:rFonts w:ascii="Symbol" w:hAnsi="Symbol" w:cs="Symbol" w:hint="default"/>
+      </w:rPr>
+    </w:lvl>
+    <w:lvl w:ilvl="4">
+      <w:start w:val="1"/>
+      <w:numFmt w:val="bullet"/>
+      <w:lvlText w:val=""/>
+      <w:lvlJc w:val="left"/>
+      <w:pPr>
+        <w:tabs>
+          <w:tab w:val="num" w:pos="3545"/>
+        </w:tabs>
+        <w:ind w:left="3545" w:hanging="283"/>
+      </w:pPr>
+      <w:rPr>
+        <w:rFonts w:ascii="Symbol" w:hAnsi="Symbol" w:cs="Symbol" w:hint="default"/>
+      </w:rPr>
+    </w:lvl>
+    <w:lvl w:ilvl="5">
+      <w:start w:val="1"/>
+      <w:numFmt w:val="bullet"/>
+      <w:lvlText w:val=""/>
+      <w:lvlJc w:val="left"/>
+      <w:pPr>
+        <w:tabs>
+          <w:tab w:val="num" w:pos="4254"/>
+        </w:tabs>
+        <w:ind w:left="4254" w:hanging="283"/>
+      </w:pPr>
+      <w:rPr>
+        <w:rFonts w:ascii="Symbol" w:hAnsi="Symbol" w:cs="Symbol" w:hint="default"/>
+      </w:rPr>
+    </w:lvl>
+    <w:lvl w:ilvl="6">
+      <w:start w:val="1"/>
+      <w:numFmt w:val="bullet"/>
+      <w:lvlText w:val=""/>
+      <w:lvlJc w:val="left"/>
+      <w:pPr>
+        <w:tabs>
+          <w:tab w:val="num" w:pos="4963"/>
+        </w:tabs>
+        <w:ind w:left="4963" w:hanging="283"/>
+      </w:pPr>
+      <w:rPr>
+        <w:rFonts w:ascii="Symbol" w:hAnsi="Symbol" w:cs="Symbol" w:hint="default"/>
+      </w:rPr>
+    </w:lvl>
+    <w:lvl w:ilvl="7">
+      <w:start w:val="1"/>
+      <w:numFmt w:val="bullet"/>
+      <w:lvlText w:val=""/>
+      <w:lvlJc w:val="left"/>
+      <w:pPr>
+        <w:tabs>
+          <w:tab w:val="num" w:pos="5672"/>
+        </w:tabs>
+        <w:ind w:left="5672" w:hanging="283"/>
+      </w:pPr>
+      <w:rPr>
+        <w:rFonts w:ascii="Symbol" w:hAnsi="Symbol" w:cs="Symbol" w:hint="default"/>
+      </w:rPr>
+    </w:lvl>
+    <w:lvl w:ilvl="8">
+      <w:start w:val="1"/>
+      <w:numFmt w:val="bullet"/>
+      <w:lvlText w:val=""/>
+      <w:lvlJc w:val="left"/>
+      <w:pPr>
+        <w:tabs>
+          <w:tab w:val="num" w:pos="6381"/>
+        </w:tabs>
+        <w:ind w:left="6381" w:hanging="283"/>
+      </w:pPr>
+      <w:rPr>
+        <w:rFonts w:ascii="Symbol" w:hAnsi="Symbol" w:cs="Symbol" w:hint="default"/>
+      </w:rPr>
+    </w:lvl>
+  </w:abstractNum>
+  <w:abstractNum w:abstractNumId="12">
+    <w:lvl w:ilvl="0">
+      <w:start w:val="1"/>
+      <w:numFmt w:val="bullet"/>
+      <w:lvlText w:val=""/>
+      <w:lvlJc w:val="left"/>
+      <w:pPr>
+        <w:tabs>
+          <w:tab w:val="num" w:pos="709"/>
+        </w:tabs>
+        <w:ind w:left="709" w:hanging="283"/>
+      </w:pPr>
+      <w:rPr>
+        <w:rFonts w:ascii="Symbol" w:hAnsi="Symbol" w:cs="Symbol" w:hint="default"/>
+      </w:rPr>
+    </w:lvl>
+    <w:lvl w:ilvl="1">
+      <w:start w:val="1"/>
+      <w:numFmt w:val="bullet"/>
+      <w:lvlText w:val=""/>
+      <w:lvlJc w:val="left"/>
+      <w:pPr>
+        <w:tabs>
+          <w:tab w:val="num" w:pos="1418"/>
+        </w:tabs>
+        <w:ind w:left="1418" w:hanging="283"/>
+      </w:pPr>
+      <w:rPr>
+        <w:rFonts w:ascii="Symbol" w:hAnsi="Symbol" w:cs="Symbol" w:hint="default"/>
+      </w:rPr>
+    </w:lvl>
+    <w:lvl w:ilvl="2">
+      <w:start w:val="1"/>
+      <w:numFmt w:val="bullet"/>
+      <w:lvlText w:val=""/>
+      <w:lvlJc w:val="left"/>
+      <w:pPr>
+        <w:tabs>
+          <w:tab w:val="num" w:pos="2127"/>
+        </w:tabs>
+        <w:ind w:left="2127" w:hanging="283"/>
+      </w:pPr>
+      <w:rPr>
+        <w:rFonts w:ascii="Symbol" w:hAnsi="Symbol" w:cs="Symbol" w:hint="default"/>
+      </w:rPr>
+    </w:lvl>
+    <w:lvl w:ilvl="3">
+      <w:start w:val="1"/>
+      <w:numFmt w:val="bullet"/>
+      <w:lvlText w:val=""/>
+      <w:lvlJc w:val="left"/>
+      <w:pPr>
+        <w:tabs>
+          <w:tab w:val="num" w:pos="2836"/>
+        </w:tabs>
+        <w:ind w:left="2836" w:hanging="283"/>
+      </w:pPr>
+      <w:rPr>
+        <w:rFonts w:ascii="Symbol" w:hAnsi="Symbol" w:cs="Symbol" w:hint="default"/>
+      </w:rPr>
+    </w:lvl>
+    <w:lvl w:ilvl="4">
+      <w:start w:val="1"/>
+      <w:numFmt w:val="bullet"/>
+      <w:lvlText w:val=""/>
+      <w:lvlJc w:val="left"/>
+      <w:pPr>
+        <w:tabs>
+          <w:tab w:val="num" w:pos="3545"/>
+        </w:tabs>
+        <w:ind w:left="3545" w:hanging="283"/>
+      </w:pPr>
+      <w:rPr>
+        <w:rFonts w:ascii="Symbol" w:hAnsi="Symbol" w:cs="Symbol" w:hint="default"/>
+      </w:rPr>
+    </w:lvl>
+    <w:lvl w:ilvl="5">
+      <w:start w:val="1"/>
+      <w:numFmt w:val="bullet"/>
+      <w:lvlText w:val=""/>
+      <w:lvlJc w:val="left"/>
+      <w:pPr>
+        <w:tabs>
+          <w:tab w:val="num" w:pos="4254"/>
+        </w:tabs>
+        <w:ind w:left="4254" w:hanging="283"/>
+      </w:pPr>
+      <w:rPr>
+        <w:rFonts w:ascii="Symbol" w:hAnsi="Symbol" w:cs="Symbol" w:hint="default"/>
+      </w:rPr>
+    </w:lvl>
+    <w:lvl w:ilvl="6">
+      <w:start w:val="1"/>
+      <w:numFmt w:val="bullet"/>
+      <w:lvlText w:val=""/>
+      <w:lvlJc w:val="left"/>
+      <w:pPr>
+        <w:tabs>
+          <w:tab w:val="num" w:pos="4963"/>
+        </w:tabs>
+        <w:ind w:left="4963" w:hanging="283"/>
+      </w:pPr>
+      <w:rPr>
+        <w:rFonts w:ascii="Symbol" w:hAnsi="Symbol" w:cs="Symbol" w:hint="default"/>
+      </w:rPr>
+    </w:lvl>
+    <w:lvl w:ilvl="7">
+      <w:start w:val="1"/>
+      <w:numFmt w:val="bullet"/>
+      <w:lvlText w:val=""/>
+      <w:lvlJc w:val="left"/>
+      <w:pPr>
+        <w:tabs>
+          <w:tab w:val="num" w:pos="5672"/>
+        </w:tabs>
+        <w:ind w:left="5672" w:hanging="283"/>
+      </w:pPr>
+      <w:rPr>
+        <w:rFonts w:ascii="Symbol" w:hAnsi="Symbol" w:cs="Symbol" w:hint="default"/>
+      </w:rPr>
+    </w:lvl>
+    <w:lvl w:ilvl="8">
+      <w:start w:val="1"/>
+      <w:numFmt w:val="bullet"/>
+      <w:lvlText w:val=""/>
+      <w:lvlJc w:val="left"/>
+      <w:pPr>
+        <w:tabs>
+          <w:tab w:val="num" w:pos="6381"/>
+        </w:tabs>
+        <w:ind w:left="6381" w:hanging="283"/>
+      </w:pPr>
+      <w:rPr>
+        <w:rFonts w:ascii="Symbol" w:hAnsi="Symbol" w:cs="Symbol" w:hint="default"/>
+      </w:rPr>
+    </w:lvl>
+  </w:abstractNum>
+  <w:abstractNum w:abstractNumId="13">
+    <w:lvl w:ilvl="0">
+      <w:start w:val="1"/>
+      <w:numFmt w:val="bullet"/>
+      <w:lvlText w:val=""/>
+      <w:lvlJc w:val="left"/>
+      <w:pPr>
+        <w:tabs>
+          <w:tab w:val="num" w:pos="709"/>
+        </w:tabs>
+        <w:ind w:left="709" w:hanging="283"/>
+      </w:pPr>
+      <w:rPr>
+        <w:rFonts w:ascii="Symbol" w:hAnsi="Symbol" w:cs="Symbol" w:hint="default"/>
+      </w:rPr>
+    </w:lvl>
+    <w:lvl w:ilvl="1">
+      <w:start w:val="1"/>
+      <w:numFmt w:val="bullet"/>
+      <w:lvlText w:val=""/>
+      <w:lvlJc w:val="left"/>
+      <w:pPr>
+        <w:tabs>
+          <w:tab w:val="num" w:pos="1418"/>
+        </w:tabs>
+        <w:ind w:left="1418" w:hanging="283"/>
+      </w:pPr>
+      <w:rPr>
+        <w:rFonts w:ascii="Symbol" w:hAnsi="Symbol" w:cs="Symbol" w:hint="default"/>
+      </w:rPr>
+    </w:lvl>
+    <w:lvl w:ilvl="2">
+      <w:start w:val="1"/>
+      <w:numFmt w:val="bullet"/>
+      <w:lvlText w:val=""/>
+      <w:lvlJc w:val="left"/>
+      <w:pPr>
+        <w:tabs>
+          <w:tab w:val="num" w:pos="2127"/>
+        </w:tabs>
+        <w:ind w:left="2127" w:hanging="283"/>
+      </w:pPr>
+      <w:rPr>
+        <w:rFonts w:ascii="Symbol" w:hAnsi="Symbol" w:cs="Symbol" w:hint="default"/>
+      </w:rPr>
+    </w:lvl>
+    <w:lvl w:ilvl="3">
+      <w:start w:val="1"/>
+      <w:numFmt w:val="bullet"/>
+      <w:lvlText w:val=""/>
+      <w:lvlJc w:val="left"/>
+      <w:pPr>
+        <w:tabs>
+          <w:tab w:val="num" w:pos="2836"/>
+        </w:tabs>
+        <w:ind w:left="2836" w:hanging="283"/>
+      </w:pPr>
+      <w:rPr>
+        <w:rFonts w:ascii="Symbol" w:hAnsi="Symbol" w:cs="Symbol" w:hint="default"/>
+      </w:rPr>
+    </w:lvl>
+    <w:lvl w:ilvl="4">
+      <w:start w:val="1"/>
+      <w:numFmt w:val="bullet"/>
+      <w:lvlText w:val=""/>
+      <w:lvlJc w:val="left"/>
+      <w:pPr>
+        <w:tabs>
+          <w:tab w:val="num" w:pos="3545"/>
+        </w:tabs>
+        <w:ind w:left="3545" w:hanging="283"/>
+      </w:pPr>
+      <w:rPr>
+        <w:rFonts w:ascii="Symbol" w:hAnsi="Symbol" w:cs="Symbol" w:hint="default"/>
+      </w:rPr>
+    </w:lvl>
+    <w:lvl w:ilvl="5">
+      <w:start w:val="1"/>
+      <w:numFmt w:val="bullet"/>
+      <w:lvlText w:val=""/>
+      <w:lvlJc w:val="left"/>
+      <w:pPr>
+        <w:tabs>
+          <w:tab w:val="num" w:pos="4254"/>
+        </w:tabs>
+        <w:ind w:left="4254" w:hanging="283"/>
+      </w:pPr>
+      <w:rPr>
+        <w:rFonts w:ascii="Symbol" w:hAnsi="Symbol" w:cs="Symbol" w:hint="default"/>
+      </w:rPr>
+    </w:lvl>
+    <w:lvl w:ilvl="6">
+      <w:start w:val="1"/>
+      <w:numFmt w:val="bullet"/>
+      <w:lvlText w:val=""/>
+      <w:lvlJc w:val="left"/>
+      <w:pPr>
+        <w:tabs>
+          <w:tab w:val="num" w:pos="4963"/>
+        </w:tabs>
+        <w:ind w:left="4963" w:hanging="283"/>
+      </w:pPr>
+      <w:rPr>
+        <w:rFonts w:ascii="Symbol" w:hAnsi="Symbol" w:cs="Symbol" w:hint="default"/>
+      </w:rPr>
+    </w:lvl>
+    <w:lvl w:ilvl="7">
+      <w:start w:val="1"/>
+      <w:numFmt w:val="bullet"/>
+      <w:lvlText w:val=""/>
+      <w:lvlJc w:val="left"/>
+      <w:pPr>
+        <w:tabs>
+          <w:tab w:val="num" w:pos="5672"/>
+        </w:tabs>
+        <w:ind w:left="5672" w:hanging="283"/>
+      </w:pPr>
+      <w:rPr>
+        <w:rFonts w:ascii="Symbol" w:hAnsi="Symbol" w:cs="Symbol" w:hint="default"/>
+      </w:rPr>
+    </w:lvl>
+    <w:lvl w:ilvl="8">
+      <w:start w:val="1"/>
+      <w:numFmt w:val="bullet"/>
+      <w:lvlText w:val=""/>
+      <w:lvlJc w:val="left"/>
+      <w:pPr>
+        <w:tabs>
+          <w:tab w:val="num" w:pos="6381"/>
+        </w:tabs>
+        <w:ind w:left="6381" w:hanging="283"/>
+      </w:pPr>
+      <w:rPr>
+        <w:rFonts w:ascii="Symbol" w:hAnsi="Symbol" w:cs="Symbol" w:hint="default"/>
+      </w:rPr>
+    </w:lvl>
+  </w:abstractNum>
+  <w:abstractNum w:abstractNumId="14">
+    <w:lvl w:ilvl="0">
+      <w:start w:val="1"/>
+      <w:numFmt w:val="bullet"/>
+      <w:lvlText w:val=""/>
+      <w:lvlJc w:val="left"/>
+      <w:pPr>
+        <w:tabs>
+          <w:tab w:val="num" w:pos="709"/>
+        </w:tabs>
+        <w:ind w:left="709" w:hanging="283"/>
+      </w:pPr>
+      <w:rPr>
+        <w:rFonts w:ascii="Symbol" w:hAnsi="Symbol" w:cs="Symbol" w:hint="default"/>
+      </w:rPr>
+    </w:lvl>
+    <w:lvl w:ilvl="1">
+      <w:start w:val="1"/>
+      <w:numFmt w:val="bullet"/>
+      <w:lvlText w:val=""/>
+      <w:lvlJc w:val="left"/>
+      <w:pPr>
+        <w:tabs>
+          <w:tab w:val="num" w:pos="1418"/>
+        </w:tabs>
+        <w:ind w:left="1418" w:hanging="283"/>
+      </w:pPr>
+      <w:rPr>
+        <w:rFonts w:ascii="Symbol" w:hAnsi="Symbol" w:cs="Symbol" w:hint="default"/>
+      </w:rPr>
+    </w:lvl>
+    <w:lvl w:ilvl="2">
+      <w:start w:val="1"/>
+      <w:numFmt w:val="bullet"/>
+      <w:lvlText w:val=""/>
+      <w:lvlJc w:val="left"/>
+      <w:pPr>
+        <w:tabs>
+          <w:tab w:val="num" w:pos="2127"/>
+        </w:tabs>
+        <w:ind w:left="2127" w:hanging="283"/>
+      </w:pPr>
+      <w:rPr>
+        <w:rFonts w:ascii="Symbol" w:hAnsi="Symbol" w:cs="Symbol" w:hint="default"/>
+      </w:rPr>
+    </w:lvl>
+    <w:lvl w:ilvl="3">
+      <w:start w:val="1"/>
+      <w:numFmt w:val="bullet"/>
+      <w:lvlText w:val=""/>
+      <w:lvlJc w:val="left"/>
+      <w:pPr>
+        <w:tabs>
+          <w:tab w:val="num" w:pos="2836"/>
+        </w:tabs>
+        <w:ind w:left="2836" w:hanging="283"/>
+      </w:pPr>
+      <w:rPr>
+        <w:rFonts w:ascii="Symbol" w:hAnsi="Symbol" w:cs="Symbol" w:hint="default"/>
+      </w:rPr>
+    </w:lvl>
+    <w:lvl w:ilvl="4">
+      <w:start w:val="1"/>
+      <w:numFmt w:val="bullet"/>
+      <w:lvlText w:val=""/>
+      <w:lvlJc w:val="left"/>
+      <w:pPr>
+        <w:tabs>
+          <w:tab w:val="num" w:pos="3545"/>
+        </w:tabs>
+        <w:ind w:left="3545" w:hanging="283"/>
+      </w:pPr>
+      <w:rPr>
+        <w:rFonts w:ascii="Symbol" w:hAnsi="Symbol" w:cs="Symbol" w:hint="default"/>
+      </w:rPr>
+    </w:lvl>
+    <w:lvl w:ilvl="5">
+      <w:start w:val="1"/>
+      <w:numFmt w:val="bullet"/>
+      <w:lvlText w:val=""/>
+      <w:lvlJc w:val="left"/>
+      <w:pPr>
+        <w:tabs>
+          <w:tab w:val="num" w:pos="4254"/>
+        </w:tabs>
+        <w:ind w:left="4254" w:hanging="283"/>
+      </w:pPr>
+      <w:rPr>
+        <w:rFonts w:ascii="Symbol" w:hAnsi="Symbol" w:cs="Symbol" w:hint="default"/>
+      </w:rPr>
+    </w:lvl>
+    <w:lvl w:ilvl="6">
+      <w:start w:val="1"/>
+      <w:numFmt w:val="bullet"/>
+      <w:lvlText w:val=""/>
+      <w:lvlJc w:val="left"/>
+      <w:pPr>
+        <w:tabs>
+          <w:tab w:val="num" w:pos="4963"/>
+        </w:tabs>
+        <w:ind w:left="4963" w:hanging="283"/>
+      </w:pPr>
+      <w:rPr>
+        <w:rFonts w:ascii="Symbol" w:hAnsi="Symbol" w:cs="Symbol" w:hint="default"/>
+      </w:rPr>
+    </w:lvl>
+    <w:lvl w:ilvl="7">
+      <w:start w:val="1"/>
+      <w:numFmt w:val="bullet"/>
+      <w:lvlText w:val=""/>
+      <w:lvlJc w:val="left"/>
+      <w:pPr>
+        <w:tabs>
+          <w:tab w:val="num" w:pos="5672"/>
+        </w:tabs>
+        <w:ind w:left="5672" w:hanging="283"/>
+      </w:pPr>
+      <w:rPr>
+        <w:rFonts w:ascii="Symbol" w:hAnsi="Symbol" w:cs="Symbol" w:hint="default"/>
+      </w:rPr>
+    </w:lvl>
+    <w:lvl w:ilvl="8">
+      <w:start w:val="1"/>
+      <w:numFmt w:val="bullet"/>
+      <w:lvlText w:val=""/>
+      <w:lvlJc w:val="left"/>
+      <w:pPr>
+        <w:tabs>
+          <w:tab w:val="num" w:pos="6381"/>
+        </w:tabs>
+        <w:ind w:left="6381" w:hanging="283"/>
+      </w:pPr>
+      <w:rPr>
+        <w:rFonts w:ascii="Symbol" w:hAnsi="Symbol" w:cs="Symbol" w:hint="default"/>
+      </w:rPr>
+    </w:lvl>
+  </w:abstractNum>
+  <w:abstractNum w:abstractNumId="15">
+    <w:lvl w:ilvl="0">
+      <w:start w:val="1"/>
+      <w:numFmt w:val="bullet"/>
+      <w:lvlText w:val=""/>
+      <w:lvlJc w:val="left"/>
+      <w:pPr>
+        <w:tabs>
+          <w:tab w:val="num" w:pos="709"/>
+        </w:tabs>
+        <w:ind w:left="709" w:hanging="283"/>
+      </w:pPr>
+      <w:rPr>
+        <w:rFonts w:ascii="Symbol" w:hAnsi="Symbol" w:cs="Symbol" w:hint="default"/>
+      </w:rPr>
+    </w:lvl>
+    <w:lvl w:ilvl="1">
+      <w:start w:val="1"/>
+      <w:numFmt w:val="bullet"/>
+      <w:lvlText w:val=""/>
+      <w:lvlJc w:val="left"/>
+      <w:pPr>
+        <w:tabs>
+          <w:tab w:val="num" w:pos="1418"/>
+        </w:tabs>
+        <w:ind w:left="1418" w:hanging="283"/>
+      </w:pPr>
+      <w:rPr>
+        <w:rFonts w:ascii="Symbol" w:hAnsi="Symbol" w:cs="Symbol" w:hint="default"/>
+      </w:rPr>
+    </w:lvl>
+    <w:lvl w:ilvl="2">
+      <w:start w:val="1"/>
+      <w:numFmt w:val="bullet"/>
+      <w:lvlText w:val=""/>
+      <w:lvlJc w:val="left"/>
+      <w:pPr>
+        <w:tabs>
+          <w:tab w:val="num" w:pos="2127"/>
+        </w:tabs>
+        <w:ind w:left="2127" w:hanging="283"/>
+      </w:pPr>
+      <w:rPr>
+        <w:rFonts w:ascii="Symbol" w:hAnsi="Symbol" w:cs="Symbol" w:hint="default"/>
+      </w:rPr>
+    </w:lvl>
+    <w:lvl w:ilvl="3">
+      <w:start w:val="1"/>
+      <w:numFmt w:val="bullet"/>
+      <w:lvlText w:val=""/>
+      <w:lvlJc w:val="left"/>
+      <w:pPr>
+        <w:tabs>
+          <w:tab w:val="num" w:pos="2836"/>
+        </w:tabs>
+        <w:ind w:left="2836" w:hanging="283"/>
+      </w:pPr>
+      <w:rPr>
+        <w:rFonts w:ascii="Symbol" w:hAnsi="Symbol" w:cs="Symbol" w:hint="default"/>
+      </w:rPr>
+    </w:lvl>
+    <w:lvl w:ilvl="4">
+      <w:start w:val="1"/>
+      <w:numFmt w:val="bullet"/>
+      <w:lvlText w:val=""/>
+      <w:lvlJc w:val="left"/>
+      <w:pPr>
+        <w:tabs>
+          <w:tab w:val="num" w:pos="3545"/>
+        </w:tabs>
+        <w:ind w:left="3545" w:hanging="283"/>
+      </w:pPr>
+      <w:rPr>
+        <w:rFonts w:ascii="Symbol" w:hAnsi="Symbol" w:cs="Symbol" w:hint="default"/>
+      </w:rPr>
+    </w:lvl>
+    <w:lvl w:ilvl="5">
+      <w:start w:val="1"/>
+      <w:numFmt w:val="bullet"/>
+      <w:lvlText w:val=""/>
+      <w:lvlJc w:val="left"/>
+      <w:pPr>
+        <w:tabs>
+          <w:tab w:val="num" w:pos="4254"/>
+        </w:tabs>
+        <w:ind w:left="4254" w:hanging="283"/>
+      </w:pPr>
+      <w:rPr>
+        <w:rFonts w:ascii="Symbol" w:hAnsi="Symbol" w:cs="Symbol" w:hint="default"/>
+      </w:rPr>
+    </w:lvl>
+    <w:lvl w:ilvl="6">
+      <w:start w:val="1"/>
+      <w:numFmt w:val="bullet"/>
+      <w:lvlText w:val=""/>
+      <w:lvlJc w:val="left"/>
+      <w:pPr>
+        <w:tabs>
+          <w:tab w:val="num" w:pos="4963"/>
+        </w:tabs>
+        <w:ind w:left="4963" w:hanging="283"/>
+      </w:pPr>
+      <w:rPr>
+        <w:rFonts w:ascii="Symbol" w:hAnsi="Symbol" w:cs="Symbol" w:hint="default"/>
+      </w:rPr>
+    </w:lvl>
+    <w:lvl w:ilvl="7">
+      <w:start w:val="1"/>
+      <w:numFmt w:val="bullet"/>
+      <w:lvlText w:val=""/>
+      <w:lvlJc w:val="left"/>
+      <w:pPr>
+        <w:tabs>
+          <w:tab w:val="num" w:pos="5672"/>
+        </w:tabs>
+        <w:ind w:left="5672" w:hanging="283"/>
+      </w:pPr>
+      <w:rPr>
+        <w:rFonts w:ascii="Symbol" w:hAnsi="Symbol" w:cs="Symbol" w:hint="default"/>
+      </w:rPr>
+    </w:lvl>
+    <w:lvl w:ilvl="8">
+      <w:start w:val="1"/>
+      <w:numFmt w:val="bullet"/>
+      <w:lvlText w:val=""/>
+      <w:lvlJc w:val="left"/>
+      <w:pPr>
+        <w:tabs>
+          <w:tab w:val="num" w:pos="6381"/>
+        </w:tabs>
+        <w:ind w:left="6381" w:hanging="283"/>
+      </w:pPr>
+      <w:rPr>
+        <w:rFonts w:ascii="Symbol" w:hAnsi="Symbol" w:cs="Symbol" w:hint="default"/>
+      </w:rPr>
+    </w:lvl>
+  </w:abstractNum>
+  <w:abstractNum w:abstractNumId="16">
+    <w:lvl w:ilvl="0">
+      <w:start w:val="1"/>
+      <w:numFmt w:val="bullet"/>
+      <w:lvlText w:val=""/>
+      <w:lvlJc w:val="left"/>
+      <w:pPr>
+        <w:tabs>
+          <w:tab w:val="num" w:pos="709"/>
+        </w:tabs>
+        <w:ind w:left="709" w:hanging="283"/>
+      </w:pPr>
+      <w:rPr>
+        <w:rFonts w:ascii="Symbol" w:hAnsi="Symbol" w:cs="Symbol" w:hint="default"/>
+      </w:rPr>
+    </w:lvl>
+    <w:lvl w:ilvl="1">
+      <w:start w:val="1"/>
+      <w:numFmt w:val="bullet"/>
+      <w:lvlText w:val=""/>
+      <w:lvlJc w:val="left"/>
+      <w:pPr>
+        <w:tabs>
+          <w:tab w:val="num" w:pos="1418"/>
+        </w:tabs>
+        <w:ind w:left="1418" w:hanging="283"/>
+      </w:pPr>
+      <w:rPr>
+        <w:rFonts w:ascii="Symbol" w:hAnsi="Symbol" w:cs="Symbol" w:hint="default"/>
+      </w:rPr>
+    </w:lvl>
+    <w:lvl w:ilvl="2">
+      <w:start w:val="1"/>
+      <w:numFmt w:val="bullet"/>
+      <w:lvlText w:val=""/>
+      <w:lvlJc w:val="left"/>
+      <w:pPr>
+        <w:tabs>
+          <w:tab w:val="num" w:pos="2127"/>
+        </w:tabs>
+        <w:ind w:left="2127" w:hanging="283"/>
+      </w:pPr>
+      <w:rPr>
+        <w:rFonts w:ascii="Symbol" w:hAnsi="Symbol" w:cs="Symbol" w:hint="default"/>
+      </w:rPr>
+    </w:lvl>
+    <w:lvl w:ilvl="3">
+      <w:start w:val="1"/>
+      <w:numFmt w:val="bullet"/>
+      <w:lvlText w:val=""/>
+      <w:lvlJc w:val="left"/>
+      <w:pPr>
+        <w:tabs>
+          <w:tab w:val="num" w:pos="2836"/>
+        </w:tabs>
+        <w:ind w:left="2836" w:hanging="283"/>
+      </w:pPr>
+      <w:rPr>
+        <w:rFonts w:ascii="Symbol" w:hAnsi="Symbol" w:cs="Symbol" w:hint="default"/>
+      </w:rPr>
+    </w:lvl>
+    <w:lvl w:ilvl="4">
+      <w:start w:val="1"/>
+      <w:numFmt w:val="bullet"/>
+      <w:lvlText w:val=""/>
+      <w:lvlJc w:val="left"/>
+      <w:pPr>
+        <w:tabs>
+          <w:tab w:val="num" w:pos="3545"/>
+        </w:tabs>
+        <w:ind w:left="3545" w:hanging="283"/>
+      </w:pPr>
+      <w:rPr>
+        <w:rFonts w:ascii="Symbol" w:hAnsi="Symbol" w:cs="Symbol" w:hint="default"/>
+      </w:rPr>
+    </w:lvl>
+    <w:lvl w:ilvl="5">
+      <w:start w:val="1"/>
+      <w:numFmt w:val="bullet"/>
+      <w:lvlText w:val=""/>
+      <w:lvlJc w:val="left"/>
+      <w:pPr>
+        <w:tabs>
+          <w:tab w:val="num" w:pos="4254"/>
+        </w:tabs>
+        <w:ind w:left="4254" w:hanging="283"/>
+      </w:pPr>
+      <w:rPr>
+        <w:rFonts w:ascii="Symbol" w:hAnsi="Symbol" w:cs="Symbol" w:hint="default"/>
+      </w:rPr>
+    </w:lvl>
+    <w:lvl w:ilvl="6">
+      <w:start w:val="1"/>
+      <w:numFmt w:val="bullet"/>
+      <w:lvlText w:val=""/>
+      <w:lvlJc w:val="left"/>
+      <w:pPr>
+        <w:tabs>
+          <w:tab w:val="num" w:pos="4963"/>
+        </w:tabs>
+        <w:ind w:left="4963" w:hanging="283"/>
+      </w:pPr>
+      <w:rPr>
+        <w:rFonts w:ascii="Symbol" w:hAnsi="Symbol" w:cs="Symbol" w:hint="default"/>
+      </w:rPr>
+    </w:lvl>
+    <w:lvl w:ilvl="7">
+      <w:start w:val="1"/>
+      <w:numFmt w:val="bullet"/>
+      <w:lvlText w:val=""/>
+      <w:lvlJc w:val="left"/>
+      <w:pPr>
+        <w:tabs>
+          <w:tab w:val="num" w:pos="5672"/>
+        </w:tabs>
+        <w:ind w:left="5672" w:hanging="283"/>
+      </w:pPr>
+      <w:rPr>
+        <w:rFonts w:ascii="Symbol" w:hAnsi="Symbol" w:cs="Symbol" w:hint="default"/>
+      </w:rPr>
+    </w:lvl>
+    <w:lvl w:ilvl="8">
+      <w:start w:val="1"/>
+      <w:numFmt w:val="bullet"/>
+      <w:lvlText w:val=""/>
+      <w:lvlJc w:val="left"/>
+      <w:pPr>
+        <w:tabs>
+          <w:tab w:val="num" w:pos="6381"/>
+        </w:tabs>
+        <w:ind w:left="6381" w:hanging="283"/>
+      </w:pPr>
+      <w:rPr>
+        <w:rFonts w:ascii="Symbol" w:hAnsi="Symbol" w:cs="Symbol" w:hint="default"/>
+      </w:rPr>
+    </w:lvl>
+  </w:abstractNum>
+  <w:abstractNum w:abstractNumId="17">
+    <w:lvl w:ilvl="0">
+      <w:start w:val="1"/>
+      <w:numFmt w:val="bullet"/>
+      <w:lvlText w:val=""/>
+      <w:lvlJc w:val="left"/>
+      <w:pPr>
+        <w:tabs>
+          <w:tab w:val="num" w:pos="709"/>
+        </w:tabs>
+        <w:ind w:left="709" w:hanging="283"/>
+      </w:pPr>
+      <w:rPr>
+        <w:rFonts w:ascii="Symbol" w:hAnsi="Symbol" w:cs="Symbol" w:hint="default"/>
+      </w:rPr>
+    </w:lvl>
+    <w:lvl w:ilvl="1">
+      <w:start w:val="1"/>
+      <w:numFmt w:val="bullet"/>
+      <w:lvlText w:val=""/>
+      <w:lvlJc w:val="left"/>
+      <w:pPr>
+        <w:tabs>
+          <w:tab w:val="num" w:pos="1418"/>
+        </w:tabs>
+        <w:ind w:left="1418" w:hanging="283"/>
+      </w:pPr>
+      <w:rPr>
+        <w:rFonts w:ascii="Symbol" w:hAnsi="Symbol" w:cs="Symbol" w:hint="default"/>
+      </w:rPr>
+    </w:lvl>
+    <w:lvl w:ilvl="2">
+      <w:start w:val="1"/>
+      <w:numFmt w:val="bullet"/>
+      <w:lvlText w:val=""/>
+      <w:lvlJc w:val="left"/>
+      <w:pPr>
+        <w:tabs>
+          <w:tab w:val="num" w:pos="2127"/>
+        </w:tabs>
+        <w:ind w:left="2127" w:hanging="283"/>
+      </w:pPr>
+      <w:rPr>
+        <w:rFonts w:ascii="Symbol" w:hAnsi="Symbol" w:cs="Symbol" w:hint="default"/>
+      </w:rPr>
+    </w:lvl>
+    <w:lvl w:ilvl="3">
+      <w:start w:val="1"/>
+      <w:numFmt w:val="bullet"/>
+      <w:lvlText w:val=""/>
+      <w:lvlJc w:val="left"/>
+      <w:pPr>
+        <w:tabs>
+          <w:tab w:val="num" w:pos="2836"/>
+        </w:tabs>
+        <w:ind w:left="2836" w:hanging="283"/>
+      </w:pPr>
+      <w:rPr>
+        <w:rFonts w:ascii="Symbol" w:hAnsi="Symbol" w:cs="Symbol" w:hint="default"/>
+      </w:rPr>
+    </w:lvl>
+    <w:lvl w:ilvl="4">
+      <w:start w:val="1"/>
+      <w:numFmt w:val="bullet"/>
+      <w:lvlText w:val=""/>
+      <w:lvlJc w:val="left"/>
+      <w:pPr>
+        <w:tabs>
+          <w:tab w:val="num" w:pos="3545"/>
+        </w:tabs>
+        <w:ind w:left="3545" w:hanging="283"/>
+      </w:pPr>
+      <w:rPr>
+        <w:rFonts w:ascii="Symbol" w:hAnsi="Symbol" w:cs="Symbol" w:hint="default"/>
+      </w:rPr>
+    </w:lvl>
+    <w:lvl w:ilvl="5">
+      <w:start w:val="1"/>
+      <w:numFmt w:val="bullet"/>
+      <w:lvlText w:val=""/>
+      <w:lvlJc w:val="left"/>
+      <w:pPr>
+        <w:tabs>
+          <w:tab w:val="num" w:pos="4254"/>
+        </w:tabs>
+        <w:ind w:left="4254" w:hanging="283"/>
+      </w:pPr>
+      <w:rPr>
+        <w:rFonts w:ascii="Symbol" w:hAnsi="Symbol" w:cs="Symbol" w:hint="default"/>
+      </w:rPr>
+    </w:lvl>
+    <w:lvl w:ilvl="6">
+      <w:start w:val="1"/>
+      <w:numFmt w:val="bullet"/>
+      <w:lvlText w:val=""/>
+      <w:lvlJc w:val="left"/>
+      <w:pPr>
+        <w:tabs>
+          <w:tab w:val="num" w:pos="4963"/>
+        </w:tabs>
+        <w:ind w:left="4963" w:hanging="283"/>
+      </w:pPr>
+      <w:rPr>
+        <w:rFonts w:ascii="Symbol" w:hAnsi="Symbol" w:cs="Symbol" w:hint="default"/>
+      </w:rPr>
+    </w:lvl>
+    <w:lvl w:ilvl="7">
+      <w:start w:val="1"/>
+      <w:numFmt w:val="bullet"/>
+      <w:lvlText w:val=""/>
+      <w:lvlJc w:val="left"/>
+      <w:pPr>
+        <w:tabs>
+          <w:tab w:val="num" w:pos="5672"/>
+        </w:tabs>
+        <w:ind w:left="5672" w:hanging="283"/>
+      </w:pPr>
+      <w:rPr>
+        <w:rFonts w:ascii="Symbol" w:hAnsi="Symbol" w:cs="Symbol" w:hint="default"/>
+      </w:rPr>
+    </w:lvl>
+    <w:lvl w:ilvl="8">
+      <w:start w:val="1"/>
+      <w:numFmt w:val="bullet"/>
+      <w:lvlText w:val=""/>
+      <w:lvlJc w:val="left"/>
+      <w:pPr>
+        <w:tabs>
+          <w:tab w:val="num" w:pos="6381"/>
+        </w:tabs>
+        <w:ind w:left="6381" w:hanging="283"/>
+      </w:pPr>
+      <w:rPr>
+        <w:rFonts w:ascii="Symbol" w:hAnsi="Symbol" w:cs="Symbol" w:hint="default"/>
+      </w:rPr>
+    </w:lvl>
+  </w:abstractNum>
+  <w:abstractNum w:abstractNumId="18">
+    <w:lvl w:ilvl="0">
+      <w:start w:val="1"/>
+      <w:numFmt w:val="bullet"/>
+      <w:lvlText w:val=""/>
+      <w:lvlJc w:val="left"/>
+      <w:pPr>
+        <w:tabs>
+          <w:tab w:val="num" w:pos="709"/>
+        </w:tabs>
+        <w:ind w:left="709" w:hanging="283"/>
+      </w:pPr>
+      <w:rPr>
+        <w:rFonts w:ascii="Symbol" w:hAnsi="Symbol" w:cs="Symbol" w:hint="default"/>
+      </w:rPr>
+    </w:lvl>
+    <w:lvl w:ilvl="1">
+      <w:start w:val="1"/>
+      <w:numFmt w:val="bullet"/>
+      <w:lvlText w:val=""/>
+      <w:lvlJc w:val="left"/>
+      <w:pPr>
+        <w:tabs>
+          <w:tab w:val="num" w:pos="1418"/>
+        </w:tabs>
+        <w:ind w:left="1418" w:hanging="283"/>
+      </w:pPr>
+      <w:rPr>
+        <w:rFonts w:ascii="Symbol" w:hAnsi="Symbol" w:cs="Symbol" w:hint="default"/>
+      </w:rPr>
+    </w:lvl>
+    <w:lvl w:ilvl="2">
+      <w:start w:val="1"/>
+      <w:numFmt w:val="bullet"/>
+      <w:lvlText w:val=""/>
+      <w:lvlJc w:val="left"/>
+      <w:pPr>
+        <w:tabs>
+          <w:tab w:val="num" w:pos="2127"/>
+        </w:tabs>
+        <w:ind w:left="2127" w:hanging="283"/>
+      </w:pPr>
+      <w:rPr>
+        <w:rFonts w:ascii="Symbol" w:hAnsi="Symbol" w:cs="Symbol" w:hint="default"/>
+      </w:rPr>
+    </w:lvl>
+    <w:lvl w:ilvl="3">
+      <w:start w:val="1"/>
+      <w:numFmt w:val="bullet"/>
+      <w:lvlText w:val=""/>
+      <w:lvlJc w:val="left"/>
+      <w:pPr>
+        <w:tabs>
+          <w:tab w:val="num" w:pos="2836"/>
+        </w:tabs>
+        <w:ind w:left="2836" w:hanging="283"/>
+      </w:pPr>
+      <w:rPr>
+        <w:rFonts w:ascii="Symbol" w:hAnsi="Symbol" w:cs="Symbol" w:hint="default"/>
+      </w:rPr>
+    </w:lvl>
+    <w:lvl w:ilvl="4">
+      <w:start w:val="1"/>
+      <w:numFmt w:val="bullet"/>
+      <w:lvlText w:val=""/>
+      <w:lvlJc w:val="left"/>
+      <w:pPr>
+        <w:tabs>
+          <w:tab w:val="num" w:pos="3545"/>
+        </w:tabs>
+        <w:ind w:left="3545" w:hanging="283"/>
+      </w:pPr>
+      <w:rPr>
+        <w:rFonts w:ascii="Symbol" w:hAnsi="Symbol" w:cs="Symbol" w:hint="default"/>
+      </w:rPr>
+    </w:lvl>
+    <w:lvl w:ilvl="5">
+      <w:start w:val="1"/>
+      <w:numFmt w:val="bullet"/>
+      <w:lvlText w:val=""/>
+      <w:lvlJc w:val="left"/>
+      <w:pPr>
+        <w:tabs>
+          <w:tab w:val="num" w:pos="4254"/>
+        </w:tabs>
+        <w:ind w:left="4254" w:hanging="283"/>
+      </w:pPr>
+      <w:rPr>
+        <w:rFonts w:ascii="Symbol" w:hAnsi="Symbol" w:cs="Symbol" w:hint="default"/>
+      </w:rPr>
+    </w:lvl>
+    <w:lvl w:ilvl="6">
+      <w:start w:val="1"/>
+      <w:numFmt w:val="bullet"/>
+      <w:lvlText w:val=""/>
+      <w:lvlJc w:val="left"/>
+      <w:pPr>
+        <w:tabs>
+          <w:tab w:val="num" w:pos="4963"/>
+        </w:tabs>
+        <w:ind w:left="4963" w:hanging="283"/>
+      </w:pPr>
+      <w:rPr>
+        <w:rFonts w:ascii="Symbol" w:hAnsi="Symbol" w:cs="Symbol" w:hint="default"/>
+      </w:rPr>
+    </w:lvl>
+    <w:lvl w:ilvl="7">
+      <w:start w:val="1"/>
+      <w:numFmt w:val="bullet"/>
+      <w:lvlText w:val=""/>
+      <w:lvlJc w:val="left"/>
+      <w:pPr>
+        <w:tabs>
+          <w:tab w:val="num" w:pos="5672"/>
+        </w:tabs>
+        <w:ind w:left="5672" w:hanging="283"/>
+      </w:pPr>
+      <w:rPr>
+        <w:rFonts w:ascii="Symbol" w:hAnsi="Symbol" w:cs="Symbol" w:hint="default"/>
+      </w:rPr>
+    </w:lvl>
+    <w:lvl w:ilvl="8">
+      <w:start w:val="1"/>
+      <w:numFmt w:val="bullet"/>
+      <w:lvlText w:val=""/>
+      <w:lvlJc w:val="left"/>
+      <w:pPr>
+        <w:tabs>
+          <w:tab w:val="num" w:pos="6381"/>
+        </w:tabs>
+        <w:ind w:left="6381" w:hanging="283"/>
+      </w:pPr>
+      <w:rPr>
+        <w:rFonts w:ascii="Symbol" w:hAnsi="Symbol" w:cs="Symbol" w:hint="default"/>
+      </w:rPr>
+    </w:lvl>
+  </w:abstractNum>
+  <w:abstractNum w:abstractNumId="19">
     <w:lvl w:ilvl="0">
       <w:start w:val="1"/>
       <w:numFmt w:val="none"/>
@@ -2228,6 +4982,42 @@
   </w:num>
   <w:num w:numId="7">
     <w:abstractNumId w:val="7"/>
+  </w:num>
+  <w:num w:numId="8">
+    <w:abstractNumId w:val="8"/>
+  </w:num>
+  <w:num w:numId="9">
+    <w:abstractNumId w:val="9"/>
+  </w:num>
+  <w:num w:numId="10">
+    <w:abstractNumId w:val="10"/>
+  </w:num>
+  <w:num w:numId="11">
+    <w:abstractNumId w:val="11"/>
+  </w:num>
+  <w:num w:numId="12">
+    <w:abstractNumId w:val="12"/>
+  </w:num>
+  <w:num w:numId="13">
+    <w:abstractNumId w:val="13"/>
+  </w:num>
+  <w:num w:numId="14">
+    <w:abstractNumId w:val="14"/>
+  </w:num>
+  <w:num w:numId="15">
+    <w:abstractNumId w:val="15"/>
+  </w:num>
+  <w:num w:numId="16">
+    <w:abstractNumId w:val="16"/>
+  </w:num>
+  <w:num w:numId="17">
+    <w:abstractNumId w:val="17"/>
+  </w:num>
+  <w:num w:numId="18">
+    <w:abstractNumId w:val="18"/>
+  </w:num>
+  <w:num w:numId="19">
+    <w:abstractNumId w:val="19"/>
   </w:num>
 </w:numbering>
 </file>
@@ -2405,7 +5195,7 @@
       <w:kern w:val="0"/>
       <w:sz w:val="22"/>
       <w:szCs w:val="22"/>
-      <w:lang w:eastAsia="en-US" w:bidi="ar-SA" w:val="es-ES"/>
+      <w:lang w:val="es-ES" w:eastAsia="en-US" w:bidi="ar-SA"/>
     </w:rPr>
   </w:style>
   <w:style w:type="paragraph" w:styleId="Ttulo1">
@@ -2959,6 +5749,21 @@
       <w:spacing w:val="5"/>
     </w:rPr>
   </w:style>
+  <w:style w:type="character" w:styleId="Destaquemayor">
+    <w:name w:val="Strong"/>
+    <w:qFormat/>
+    <w:rPr>
+      <w:b/>
+      <w:bCs/>
+    </w:rPr>
+  </w:style>
+  <w:style w:type="character" w:styleId="Vietas">
+    <w:name w:val="Viñetas"/>
+    <w:qFormat/>
+    <w:rPr>
+      <w:rFonts w:ascii="OpenSymbol" w:hAnsi="OpenSymbol" w:eastAsia="OpenSymbol" w:cs="OpenSymbol"/>
+    </w:rPr>
+  </w:style>
   <w:style w:type="paragraph" w:styleId="Ttulo">
     <w:name w:val="Título"/>
     <w:basedOn w:val="Normal"/>
@@ -3085,7 +5890,7 @@
       <w:kern w:val="0"/>
       <w:sz w:val="22"/>
       <w:szCs w:val="22"/>
-      <w:lang w:eastAsia="en-US" w:bidi="ar-SA" w:val="es-ES"/>
+      <w:lang w:val="es-ES" w:eastAsia="en-US" w:bidi="ar-SA"/>
     </w:rPr>
   </w:style>
   <w:style w:type="paragraph" w:styleId="Ttulogeneral">
@@ -3361,7 +6166,7 @@
       <w:kern w:val="0"/>
       <w:sz w:val="20"/>
       <w:szCs w:val="20"/>
-      <w:lang w:eastAsia="en-US" w:bidi="ar-SA" w:val="es-ES"/>
+      <w:lang w:val="es-ES" w:eastAsia="en-US" w:bidi="ar-SA"/>
     </w:rPr>
   </w:style>
   <w:style w:type="paragraph" w:styleId="Quote">
@@ -3441,6 +6246,36 @@
       <w:outlineLvl w:val="9"/>
     </w:pPr>
     <w:rPr/>
+  </w:style>
+  <w:style w:type="paragraph" w:styleId="Lneahorizontal">
+    <w:name w:val="Línea horizontal"/>
+    <w:basedOn w:val="Normal"/>
+    <w:next w:val="Cuerpodetexto"/>
+    <w:qFormat/>
+    <w:pPr>
+      <w:suppressLineNumbers/>
+      <w:pBdr>
+        <w:bottom w:val="double" w:sz="2" w:space="0" w:color="808080"/>
+      </w:pBdr>
+      <w:spacing w:before="0" w:after="283"/>
+    </w:pPr>
+    <w:rPr>
+      <w:sz w:val="12"/>
+      <w:szCs w:val="12"/>
+    </w:rPr>
+  </w:style>
+  <w:style w:type="paragraph" w:styleId="Textopreformateado">
+    <w:name w:val="Texto preformateado"/>
+    <w:basedOn w:val="Normal"/>
+    <w:qFormat/>
+    <w:pPr>
+      <w:spacing w:before="0" w:after="0"/>
+    </w:pPr>
+    <w:rPr>
+      <w:rFonts w:ascii="Liberation Mono" w:hAnsi="Liberation Mono" w:eastAsia="Liberation Mono" w:cs="Liberation Mono"/>
+      <w:sz w:val="20"/>
+      <w:szCs w:val="20"/>
+    </w:rPr>
   </w:style>
   <w:style w:type="numbering" w:styleId="NoList" w:default="1">
     <w:name w:val="No List"/>

</xml_diff>